<commit_message>
finalizing diploma + some scripts
</commit_message>
<xml_diff>
--- a/Առաջադրանք_ԹԵՐԹԻԿ_Հայկ_Հովսեփյան.docx
+++ b/Առաջադրանք_ԹԵՐԹԻԿ_Հայկ_Հովսեփյան.docx
@@ -380,7 +380,27 @@
           <w:szCs w:val="28"/>
           <w:lang w:val="hy-AM"/>
         </w:rPr>
-        <w:t>Հ Ա Շ Վ  Ե Բ Ա Ց Ա Տ Ր Ա Գ Ի Ր</w:t>
+        <w:t>Հ Ա Շ Վ</w:t>
+      </w:r>
+      <w:r>
+        <w:rPr>
+          <w:rFonts w:ascii="Sylfaen" w:hAnsi="Sylfaen"/>
+          <w:b/>
+          <w:sz w:val="28"/>
+          <w:szCs w:val="28"/>
+          <w:lang w:val="hy-AM"/>
+        </w:rPr>
+        <w:t xml:space="preserve"> </w:t>
+      </w:r>
+      <w:r>
+        <w:rPr>
+          <w:rFonts w:ascii="Sylfaen" w:hAnsi="Sylfaen"/>
+          <w:b/>
+          <w:sz w:val="28"/>
+          <w:szCs w:val="28"/>
+          <w:lang w:val="hy-AM"/>
+        </w:rPr>
+        <w:t>Ե Բ Ա Ց Ա Տ Ր Ա Գ Ի Ր</w:t>
       </w:r>
     </w:p>
     <w:p>
@@ -442,7 +462,7 @@
           <w:rFonts w:ascii="Times New Roman" w:hAnsi="Times New Roman"/>
           <w:i/>
           <w:iCs/>
-          <w:color w:val="0070C0"/>
+          <w:color w:val="000000" w:themeColor="text1"/>
           <w:u w:val="single"/>
           <w:lang w:val="hy-AM"/>
         </w:rPr>
@@ -540,7 +560,7 @@
           <w:rFonts w:ascii="Times New Roman" w:hAnsi="Times New Roman"/>
           <w:i/>
           <w:iCs/>
-          <w:color w:val="0070C0"/>
+          <w:color w:val="000000" w:themeColor="text1"/>
           <w:u w:val="single"/>
           <w:lang w:val="hy-AM"/>
         </w:rPr>
@@ -625,7 +645,7 @@
           <w:rFonts w:ascii="Times New Roman" w:hAnsi="Times New Roman"/>
           <w:i/>
           <w:iCs/>
-          <w:color w:val="0070C0"/>
+          <w:color w:val="000000" w:themeColor="text1"/>
           <w:u w:val="single"/>
           <w:lang w:val="hy-AM"/>
         </w:rPr>
@@ -635,7 +655,7 @@
       <w:r>
         <w:rPr>
           <w:rFonts w:ascii="Sylfaen" w:hAnsi="Sylfaen"/>
-          <w:color w:val="0070C0"/>
+          <w:color w:val="000000" w:themeColor="text1"/>
           <w:u w:val="single"/>
           <w:lang w:val="hy-AM"/>
         </w:rPr>
@@ -777,12 +797,36 @@
       </w:r>
       <w:r>
         <w:rPr>
-          <w:rFonts w:ascii="Sylfaen" w:hAnsi="Sylfaen" w:cs="Sylfaen"/>
+          <w:rFonts w:ascii="Times New Roman" w:hAnsi="Times New Roman"/>
+          <w:u w:val="single"/>
+          <w:lang w:val="hy-AM"/>
+        </w:rPr>
+        <w:t xml:space="preserve">Նարինե Ադոնց </w:t>
+      </w:r>
+      <w:r>
+        <w:rPr>
+          <w:rFonts w:ascii="Sylfaen" w:hAnsi="Sylfaen"/>
+          <w:u w:val="single"/>
+          <w:lang w:val="af-ZA"/>
+        </w:rPr>
+        <w:t>Պավլիկի</w:t>
+      </w:r>
+      <w:r>
+        <w:rPr>
+          <w:rFonts w:ascii="Times New Roman" w:hAnsi="Times New Roman"/>
           <w:color w:val="000000"/>
           <w:u w:val="single"/>
           <w:lang w:val="hy-AM"/>
         </w:rPr>
-        <w:t>_____</w:t>
+        <w:t xml:space="preserve">  </w:t>
+      </w:r>
+      <w:r>
+        <w:rPr>
+          <w:rFonts w:ascii="Sylfaen" w:hAnsi="Sylfaen"/>
+          <w:u w:val="single"/>
+          <w:lang w:val="af-ZA"/>
+        </w:rPr>
+        <w:t>տնտ.գ.թեկն.,դոցենտ</w:t>
       </w:r>
       <w:r>
         <w:rPr>
@@ -791,7 +835,7 @@
           <w:u w:val="single"/>
           <w:lang w:val="hy-AM"/>
         </w:rPr>
-        <w:t xml:space="preserve">                                                             </w:t>
+        <w:t xml:space="preserve">  </w:t>
       </w:r>
       <w:r>
         <w:rPr>
@@ -800,7 +844,43 @@
           <w:u w:val="single"/>
           <w:lang w:val="hy-AM"/>
         </w:rPr>
-        <w:t xml:space="preserve">__________________________ </w:t>
+        <w:t xml:space="preserve">            </w:t>
+      </w:r>
+      <w:r>
+        <w:rPr>
+          <w:rFonts w:ascii="Sylfaen" w:hAnsi="Sylfaen" w:cs="Sylfaen"/>
+          <w:color w:val="000000"/>
+          <w:u w:val="single"/>
+          <w:lang w:val="hy-AM"/>
+        </w:rPr>
+        <w:t xml:space="preserve"> </w:t>
+      </w:r>
+      <w:r>
+        <w:rPr>
+          <w:rFonts w:ascii="Sylfaen" w:hAnsi="Sylfaen" w:cs="Sylfaen"/>
+          <w:color w:val="000000"/>
+          <w:u w:val="single"/>
+          <w:lang w:val="hy-AM"/>
+        </w:rPr>
+        <w:t>______</w:t>
+      </w:r>
+      <w:r>
+        <w:rPr>
+          <w:rFonts w:ascii="Sylfaen" w:hAnsi="Sylfaen" w:cs="Sylfaen"/>
+          <w:color w:val="000000"/>
+          <w:u w:val="single"/>
+          <w:lang w:val="hy-AM"/>
+        </w:rPr>
+        <w:t xml:space="preserve"> </w:t>
+      </w:r>
+      <w:r>
+        <w:rPr>
+          <w:rFonts w:ascii="Sylfaen" w:hAnsi="Sylfaen" w:cs="Sylfaen"/>
+          <w:color w:val="000000"/>
+          <w:u w:val="single"/>
+          <w:lang w:val="hy-AM"/>
+        </w:rPr>
+        <w:t xml:space="preserve">______ </w:t>
       </w:r>
     </w:p>
     <w:p>
@@ -865,11 +945,19 @@
           <w:u w:val="single"/>
           <w:lang w:val="hy-AM"/>
         </w:rPr>
-        <w:t xml:space="preserve">                                                       </w:t>
-      </w:r>
-      <w:r>
-        <w:rPr>
-          <w:rFonts w:ascii="Sylfaen" w:hAnsi="Sylfaen"/>
+        <w:t xml:space="preserve">    </w:t>
+      </w:r>
+      <w:r>
+        <w:rPr>
+          <w:rFonts w:ascii="Times New Roman" w:hAnsi="Times New Roman"/>
+          <w:u w:val="single"/>
+          <w:lang w:val="it-IT"/>
+        </w:rPr>
+        <w:t>Կոստանյա</w:t>
+      </w:r>
+      <w:r>
+        <w:rPr>
+          <w:rFonts w:ascii="Times New Roman" w:hAnsi="Times New Roman"/>
           <w:u w:val="single"/>
           <w:lang w:val="hy-AM"/>
         </w:rPr>
@@ -877,19 +965,59 @@
       </w:r>
       <w:r>
         <w:rPr>
-          <w:rFonts w:ascii="Sylfaen" w:hAnsi="Sylfaen"/>
-          <w:u w:val="single"/>
-          <w:lang w:val="hy-AM"/>
-        </w:rPr>
-        <w:t>_____________</w:t>
-      </w:r>
-      <w:r>
-        <w:rPr>
-          <w:rFonts w:ascii="Sylfaen" w:hAnsi="Sylfaen"/>
-          <w:u w:val="single"/>
-          <w:lang w:val="hy-AM"/>
-        </w:rPr>
-        <w:t>_________________</w:t>
+          <w:rFonts w:ascii="Times New Roman" w:hAnsi="Times New Roman"/>
+          <w:u w:val="single"/>
+          <w:lang w:val="it-IT"/>
+        </w:rPr>
+        <w:t>Գայանե</w:t>
+      </w:r>
+      <w:r>
+        <w:rPr>
+          <w:rFonts w:ascii="Times New Roman" w:hAnsi="Times New Roman"/>
+          <w:u w:val="single"/>
+          <w:lang w:val="hy-AM"/>
+        </w:rPr>
+        <w:t xml:space="preserve"> </w:t>
+      </w:r>
+      <w:r>
+        <w:rPr>
+          <w:rFonts w:ascii="Sylfaen" w:hAnsi="Sylfaen"/>
+          <w:u w:val="single"/>
+          <w:lang w:val="af-ZA"/>
+        </w:rPr>
+        <w:t>Ռուդոլֆի, դասախոս</w:t>
+      </w:r>
+      <w:r>
+        <w:rPr>
+          <w:rFonts w:ascii="Sylfaen" w:hAnsi="Sylfaen"/>
+          <w:u w:val="single"/>
+          <w:lang w:val="hy-AM"/>
+        </w:rPr>
+        <w:t xml:space="preserve">    </w:t>
+      </w:r>
+      <w:r>
+        <w:rPr>
+          <w:rFonts w:ascii="Sylfaen" w:hAnsi="Sylfaen"/>
+          <w:u w:val="single"/>
+          <w:lang w:val="hy-AM"/>
+        </w:rPr>
+        <w:t xml:space="preserve"> </w:t>
+      </w:r>
+      <w:r>
+        <w:rPr>
+          <w:rFonts w:ascii="Sylfaen" w:hAnsi="Sylfaen"/>
+          <w:u w:val="single"/>
+          <w:lang w:val="hy-AM"/>
+        </w:rPr>
+        <w:t>_______</w:t>
+      </w:r>
+      <w:r>
+        <w:rPr>
+          <w:rFonts w:ascii="Sylfaen" w:hAnsi="Sylfaen"/>
+          <w:u w:val="single"/>
+          <w:lang w:val="hy-AM"/>
+        </w:rPr>
+        <w:t>__________</w:t>
       </w:r>
     </w:p>
     <w:p>
@@ -963,14 +1091,6 @@
           <w:rFonts w:ascii="Sylfaen" w:hAnsi="Sylfaen"/>
           <w:lang w:val="hy-AM"/>
         </w:rPr>
-        <w:t xml:space="preserve">  </w:t>
-      </w:r>
-      <w:r>
-        <w:rPr>
-          <w:rFonts w:ascii="Sylfaen" w:hAnsi="Sylfaen"/>
-          <w:u w:val="single"/>
-          <w:lang w:val="hy-AM"/>
-        </w:rPr>
         <w:t xml:space="preserve"> </w:t>
       </w:r>
       <w:r>
@@ -983,7 +1103,7 @@
       </w:r>
       <w:r>
         <w:rPr>
-          <w:rFonts w:ascii="Sylfaen" w:hAnsi="Sylfaen"/>
+          <w:rFonts w:ascii="Times New Roman" w:eastAsia="Times New Roman" w:hAnsi="Times New Roman"/>
           <w:u w:val="single"/>
           <w:lang w:val="hy-AM"/>
         </w:rPr>
@@ -991,43 +1111,67 @@
       </w:r>
       <w:r>
         <w:rPr>
+          <w:rFonts w:ascii="Times New Roman" w:eastAsia="Times New Roman" w:hAnsi="Times New Roman"/>
+          <w:u w:val="single"/>
+          <w:lang w:val="hy-AM"/>
+        </w:rPr>
+        <w:t>Սերգեյ Խաչատրյան</w:t>
+      </w:r>
+      <w:r>
+        <w:rPr>
+          <w:rFonts w:ascii="Times New Roman" w:eastAsia="Times New Roman" w:hAnsi="Times New Roman"/>
+          <w:u w:val="single"/>
+          <w:lang w:val="it-IT"/>
+        </w:rPr>
+        <w:t xml:space="preserve"> </w:t>
+      </w:r>
+      <w:r>
+        <w:rPr>
+          <w:rFonts w:ascii="Sylfaen" w:hAnsi="Sylfaen"/>
+          <w:u w:val="single"/>
+          <w:lang w:val="hy-AM"/>
+        </w:rPr>
+        <w:t>Սամվելի</w:t>
+      </w:r>
+      <w:r>
+        <w:rPr>
+          <w:rFonts w:ascii="Times New Roman" w:eastAsia="Times New Roman" w:hAnsi="Times New Roman"/>
+          <w:u w:val="single"/>
+          <w:lang w:val="it-IT"/>
+        </w:rPr>
+        <w:t xml:space="preserve"> </w:t>
+      </w:r>
+      <w:r>
+        <w:rPr>
+          <w:rFonts w:ascii="Times New Roman" w:eastAsia="Times New Roman" w:hAnsi="Times New Roman"/>
+          <w:u w:val="single"/>
+          <w:lang w:val="hy-AM"/>
+        </w:rPr>
+        <w:t>ասիստենտ,տ.գ.թ.</w:t>
+      </w:r>
+      <w:r>
+        <w:rPr>
+          <w:rFonts w:ascii="Sylfaen" w:hAnsi="Sylfaen"/>
+          <w:u w:val="single"/>
+          <w:lang w:val="hy-AM"/>
+        </w:rPr>
+        <w:t xml:space="preserve">                          </w:t>
+      </w:r>
+      <w:r>
+        <w:rPr>
+          <w:rFonts w:ascii="Sylfaen" w:hAnsi="Sylfaen"/>
+          <w:u w:val="single"/>
+          <w:lang w:val="hy-AM"/>
+        </w:rPr>
+        <w:t xml:space="preserve">             </w:t>
+      </w:r>
+      <w:r>
+        <w:rPr>
           <w:rFonts w:ascii="Sylfaen" w:hAnsi="Sylfaen"/>
           <w:u w:val="single"/>
           <w:lang w:val="hy-AM"/>
         </w:rPr>
         <w:t>_</w:t>
-      </w:r>
-      <w:r>
-        <w:rPr>
-          <w:rFonts w:ascii="Sylfaen" w:hAnsi="Sylfaen"/>
-          <w:u w:val="single"/>
-          <w:lang w:val="hy-AM"/>
-        </w:rPr>
-        <w:t xml:space="preserve">___ </w:t>
-      </w:r>
-      <w:r>
-        <w:rPr>
-          <w:rFonts w:ascii="Sylfaen" w:hAnsi="Sylfaen"/>
-          <w:u w:val="single"/>
-          <w:lang w:val="hy-AM"/>
-        </w:rPr>
-        <w:t>____</w:t>
-      </w:r>
-      <w:r>
-        <w:rPr>
-          <w:rFonts w:ascii="Sylfaen" w:hAnsi="Sylfaen"/>
-          <w:u w:val="single"/>
-          <w:lang w:val="hy-AM"/>
-        </w:rPr>
-        <w:t xml:space="preserve">                                                                         </w:t>
-      </w:r>
-      <w:r>
-        <w:rPr>
-          <w:rFonts w:ascii="Sylfaen" w:hAnsi="Sylfaen"/>
-          <w:u w:val="single"/>
-          <w:lang w:val="hy-AM"/>
-        </w:rPr>
-        <w:t>________________</w:t>
       </w:r>
     </w:p>
     <w:p>
@@ -1703,7 +1847,17 @@
           <w:u w:val="single"/>
           <w:lang w:val="hy-AM"/>
         </w:rPr>
-        <w:t xml:space="preserve">Ինֆորմատիկա (համակարգչային գիտություն)       </w:t>
+        <w:t>Ինֆորմատիկա (համ</w:t>
+      </w:r>
+      <w:bookmarkStart w:id="3" w:name="_GoBack"/>
+      <w:bookmarkEnd w:id="3"/>
+      <w:r>
+        <w:rPr>
+          <w:rFonts w:ascii="Sylfaen" w:hAnsi="Sylfaen" w:cs="Arial Armenian"/>
+          <w:u w:val="single"/>
+          <w:lang w:val="hy-AM"/>
+        </w:rPr>
+        <w:t xml:space="preserve">ակարգչային գիտություն)       </w:t>
       </w:r>
       <w:r>
         <w:rPr>
@@ -1920,6 +2074,7 @@
         <w:rPr>
           <w:rFonts w:ascii="Sylfaen" w:hAnsi="Sylfaen" w:cs="Sylfaen"/>
           <w:color w:val="000000" w:themeColor="text1"/>
+          <w:u w:val="single"/>
           <w:lang w:val="hy-AM"/>
         </w:rPr>
         <w:t>______________</w:t>
@@ -1937,7 +2092,7 @@
           <w:rFonts w:ascii="Times New Roman" w:hAnsi="Times New Roman"/>
           <w:i/>
           <w:iCs/>
-          <w:color w:val="0070C0"/>
+          <w:color w:val="000000" w:themeColor="text1"/>
           <w:u w:val="single"/>
           <w:lang w:val="hy-AM"/>
         </w:rPr>
@@ -1947,6 +2102,7 @@
         <w:rPr>
           <w:rFonts w:ascii="Sylfaen" w:hAnsi="Sylfaen" w:cs="Sylfaen"/>
           <w:color w:val="000000" w:themeColor="text1"/>
+          <w:u w:val="single"/>
           <w:lang w:val="hy-AM"/>
         </w:rPr>
         <w:t>_____________</w:t>
@@ -2099,6 +2255,7 @@
           <w:rFonts w:ascii="Sylfaen" w:hAnsi="Sylfaen"/>
           <w:b/>
           <w:bCs/>
+          <w:color w:val="000000" w:themeColor="text1"/>
           <w:lang w:val="hy-AM"/>
         </w:rPr>
       </w:pPr>
@@ -2127,13 +2284,15 @@
         <w:rPr>
           <w:rFonts w:ascii="Sylfaen" w:hAnsi="Sylfaen" w:cs="Helvetica Neue"/>
           <w:color w:val="000000" w:themeColor="text1"/>
-          <w:u w:val="single"/>
-          <w:lang w:val="hy-AM"/>
-        </w:rPr>
-      </w:pPr>
-      <w:r>
-        <w:rPr>
-          <w:rFonts w:ascii="Sylfaen" w:hAnsi="Sylfaen" w:cs="Sylfaen"/>
+          <w:sz w:val="20"/>
+          <w:u w:val="single"/>
+          <w:lang w:val="hy-AM"/>
+        </w:rPr>
+      </w:pPr>
+      <w:r>
+        <w:rPr>
+          <w:rFonts w:ascii="Sylfaen" w:hAnsi="Sylfaen" w:cs="Sylfaen"/>
+          <w:color w:val="000000" w:themeColor="text1"/>
           <w:lang w:val="hy-AM"/>
         </w:rPr>
         <w:t>1</w:t>
@@ -2141,6 +2300,7 @@
       <w:r>
         <w:rPr>
           <w:rFonts w:ascii="MS Gothic" w:eastAsia="MS Gothic" w:hAnsi="MS Gothic" w:cs="MS Gothic"/>
+          <w:color w:val="000000" w:themeColor="text1"/>
           <w:lang w:val="hy-AM"/>
         </w:rPr>
         <w:t>․</w:t>
@@ -2148,6 +2308,8 @@
       <w:r>
         <w:rPr>
           <w:rFonts w:ascii="Sylfaen" w:hAnsi="Sylfaen" w:cs="Sylfaen"/>
+          <w:color w:val="000000" w:themeColor="text1"/>
+          <w:sz w:val="20"/>
           <w:lang w:val="hy-AM"/>
         </w:rPr>
         <w:t>Աշխատանքի</w:t>
@@ -2155,6 +2317,8 @@
       <w:r>
         <w:rPr>
           <w:rFonts w:ascii="Sylfaen" w:hAnsi="Sylfaen" w:cs="Arial Armenian"/>
+          <w:color w:val="000000" w:themeColor="text1"/>
+          <w:sz w:val="20"/>
           <w:lang w:val="hy-AM"/>
         </w:rPr>
         <w:t xml:space="preserve"> </w:t>
@@ -2162,6 +2326,8 @@
       <w:r>
         <w:rPr>
           <w:rFonts w:ascii="Sylfaen" w:hAnsi="Sylfaen" w:cs="Sylfaen"/>
+          <w:color w:val="000000" w:themeColor="text1"/>
+          <w:sz w:val="20"/>
           <w:lang w:val="hy-AM"/>
         </w:rPr>
         <w:t>թեման</w:t>
@@ -2169,6 +2335,8 @@
       <w:r>
         <w:rPr>
           <w:rFonts w:ascii="Sylfaen" w:hAnsi="Sylfaen" w:cs="Arial Armenian"/>
+          <w:color w:val="000000" w:themeColor="text1"/>
+          <w:sz w:val="20"/>
           <w:lang w:val="hy-AM"/>
         </w:rPr>
         <w:t xml:space="preserve"> </w:t>
@@ -2178,7 +2346,8 @@
           <w:rFonts w:ascii="Times New Roman" w:hAnsi="Times New Roman"/>
           <w:i/>
           <w:iCs/>
-          <w:color w:val="0070C0"/>
+          <w:color w:val="000000" w:themeColor="text1"/>
+          <w:sz w:val="20"/>
           <w:u w:val="single"/>
           <w:lang w:val="hy-AM"/>
         </w:rPr>
@@ -2209,13 +2378,15 @@
         <w:rPr>
           <w:rFonts w:ascii="Sylfaen" w:hAnsi="Sylfaen" w:cs="Helvetica Neue"/>
           <w:color w:val="000000" w:themeColor="text1"/>
-          <w:u w:val="single"/>
-          <w:lang w:val="hy-AM"/>
-        </w:rPr>
-      </w:pPr>
-      <w:r>
-        <w:rPr>
-          <w:rFonts w:ascii="Sylfaen" w:hAnsi="Sylfaen" w:cs="Sylfaen"/>
+          <w:sz w:val="20"/>
+          <w:u w:val="single"/>
+          <w:lang w:val="hy-AM"/>
+        </w:rPr>
+      </w:pPr>
+      <w:r>
+        <w:rPr>
+          <w:rFonts w:ascii="Sylfaen" w:hAnsi="Sylfaen" w:cs="Sylfaen"/>
+          <w:sz w:val="20"/>
           <w:lang w:val="hy-AM"/>
         </w:rPr>
         <w:t>Առաջադրանքը</w:t>
@@ -2223,6 +2394,7 @@
       <w:r>
         <w:rPr>
           <w:rFonts w:ascii="Sylfaen" w:hAnsi="Sylfaen" w:cs="Arial Armenian"/>
+          <w:sz w:val="20"/>
           <w:lang w:val="hy-AM"/>
         </w:rPr>
         <w:t xml:space="preserve"> </w:t>
@@ -2230,6 +2402,7 @@
       <w:r>
         <w:rPr>
           <w:rFonts w:ascii="Sylfaen" w:hAnsi="Sylfaen" w:cs="Sylfaen"/>
+          <w:sz w:val="20"/>
           <w:lang w:val="hy-AM"/>
         </w:rPr>
         <w:t>հաստատված</w:t>
@@ -2237,6 +2410,7 @@
       <w:r>
         <w:rPr>
           <w:rFonts w:ascii="Sylfaen" w:hAnsi="Sylfaen" w:cs="Arial Armenian"/>
+          <w:sz w:val="20"/>
           <w:lang w:val="hy-AM"/>
         </w:rPr>
         <w:t xml:space="preserve"> </w:t>
@@ -2244,6 +2418,7 @@
       <w:r>
         <w:rPr>
           <w:rFonts w:ascii="Sylfaen" w:hAnsi="Sylfaen" w:cs="Sylfaen"/>
+          <w:sz w:val="20"/>
           <w:lang w:val="hy-AM"/>
         </w:rPr>
         <w:t>է</w:t>
@@ -2251,6 +2426,7 @@
       <w:r>
         <w:rPr>
           <w:rFonts w:ascii="Sylfaen" w:hAnsi="Sylfaen" w:cs="Arial Armenian"/>
+          <w:sz w:val="20"/>
           <w:lang w:val="hy-AM"/>
         </w:rPr>
         <w:t xml:space="preserve"> </w:t>
@@ -2258,6 +2434,7 @@
       <w:r>
         <w:rPr>
           <w:rFonts w:ascii="Sylfaen" w:hAnsi="Sylfaen" w:cs="Sylfaen"/>
+          <w:sz w:val="20"/>
           <w:lang w:val="hy-AM"/>
         </w:rPr>
         <w:t>ՀԱՊՀ</w:t>
@@ -2265,6 +2442,7 @@
       <w:r>
         <w:rPr>
           <w:rFonts w:ascii="Sylfaen" w:hAnsi="Sylfaen" w:cs="Arial Armenian"/>
+          <w:sz w:val="20"/>
           <w:lang w:val="hy-AM"/>
         </w:rPr>
         <w:t xml:space="preserve"> 202</w:t>
@@ -2272,6 +2450,7 @@
       <w:r>
         <w:rPr>
           <w:rFonts w:ascii="Sylfaen" w:hAnsi="Sylfaen" w:cs="Arial Armenian"/>
+          <w:sz w:val="20"/>
           <w:lang w:val="hy-AM"/>
         </w:rPr>
         <w:t>5</w:t>
@@ -2279,6 +2458,7 @@
       <w:r>
         <w:rPr>
           <w:rFonts w:ascii="Sylfaen" w:hAnsi="Sylfaen" w:cs="Arial Armenian"/>
+          <w:sz w:val="20"/>
           <w:lang w:val="hy-AM"/>
         </w:rPr>
         <w:t xml:space="preserve"> </w:t>
@@ -2286,6 +2466,7 @@
       <w:r>
         <w:rPr>
           <w:rFonts w:ascii="Sylfaen" w:hAnsi="Sylfaen" w:cs="Sylfaen"/>
+          <w:sz w:val="20"/>
           <w:lang w:val="hy-AM"/>
         </w:rPr>
         <w:t>թ</w:t>
@@ -2293,6 +2474,7 @@
       <w:r>
         <w:rPr>
           <w:rFonts w:ascii="Sylfaen" w:hAnsi="Sylfaen" w:cs="Arial Armenian"/>
+          <w:sz w:val="20"/>
           <w:lang w:val="hy-AM"/>
         </w:rPr>
         <w:t>.-</w:t>
@@ -2300,6 +2482,7 @@
       <w:r>
         <w:rPr>
           <w:rFonts w:ascii="Sylfaen" w:hAnsi="Sylfaen" w:cs="Sylfaen"/>
+          <w:sz w:val="20"/>
           <w:lang w:val="hy-AM"/>
         </w:rPr>
         <w:t>ի</w:t>
@@ -2307,6 +2490,7 @@
       <w:r>
         <w:rPr>
           <w:rFonts w:ascii="Sylfaen" w:hAnsi="Sylfaen" w:cs="Arial Armenian"/>
+          <w:sz w:val="20"/>
           <w:lang w:val="hy-AM"/>
         </w:rPr>
         <w:t xml:space="preserve"> </w:t>
@@ -2314,6 +2498,7 @@
       <w:r>
         <w:rPr>
           <w:rFonts w:ascii="Sylfaen" w:hAnsi="Sylfaen" w:cs="Arial Armenian"/>
+          <w:sz w:val="20"/>
           <w:u w:val="single"/>
           <w:lang w:val="hy-AM"/>
         </w:rPr>
@@ -2322,6 +2507,7 @@
       <w:r>
         <w:rPr>
           <w:rFonts w:ascii="Sylfaen" w:hAnsi="Sylfaen" w:cs="Arial Armenian"/>
+          <w:sz w:val="20"/>
           <w:u w:val="single"/>
           <w:lang w:val="hy-AM"/>
         </w:rPr>
@@ -2330,6 +2516,7 @@
       <w:r>
         <w:rPr>
           <w:rFonts w:ascii="Sylfaen" w:hAnsi="Sylfaen" w:cs="Sylfaen"/>
+          <w:sz w:val="20"/>
           <w:lang w:val="hy-AM"/>
         </w:rPr>
         <w:t>թիվ</w:t>
@@ -2337,6 +2524,7 @@
       <w:r>
         <w:rPr>
           <w:rFonts w:ascii="Sylfaen" w:hAnsi="Sylfaen" w:cs="Arial Armenian"/>
+          <w:sz w:val="20"/>
           <w:lang w:val="hy-AM"/>
         </w:rPr>
         <w:t xml:space="preserve">  </w:t>
@@ -2344,6 +2532,7 @@
       <w:r>
         <w:rPr>
           <w:rFonts w:ascii="Sylfaen" w:hAnsi="Sylfaen" w:cs="Arial Armenian"/>
+          <w:sz w:val="20"/>
           <w:u w:val="single"/>
           <w:lang w:val="hy-AM"/>
         </w:rPr>
@@ -2352,6 +2541,7 @@
       <w:r>
         <w:rPr>
           <w:rFonts w:ascii="Sylfaen" w:hAnsi="Sylfaen" w:cs="Sylfaen"/>
+          <w:sz w:val="20"/>
           <w:lang w:val="hy-AM"/>
         </w:rPr>
         <w:t>հրամանով</w:t>
@@ -2359,6 +2549,7 @@
       <w:r>
         <w:rPr>
           <w:rFonts w:ascii="Sylfaen" w:hAnsi="Sylfaen"/>
+          <w:sz w:val="20"/>
           <w:lang w:val="hy-AM"/>
         </w:rPr>
         <w:t>:</w:t>
@@ -2731,55 +2922,26 @@
       <w:pPr>
         <w:ind w:firstLine="0"/>
         <w:rPr>
-          <w:rFonts w:ascii="Sylfaen" w:hAnsi="Sylfaen"/>
-          <w:lang w:val="hy-AM"/>
-        </w:rPr>
-      </w:pPr>
-      <w:r>
-        <w:rPr>
-          <w:rFonts w:ascii="Sylfaen" w:hAnsi="Sylfaen"/>
-          <w:lang w:val="hy-AM"/>
-        </w:rPr>
-        <w:t xml:space="preserve">2. </w:t>
-      </w:r>
-      <w:r>
-        <w:rPr>
-          <w:rFonts w:ascii="Sylfaen" w:hAnsi="Sylfaen" w:cs="Sylfaen"/>
-          <w:lang w:val="hy-AM"/>
-        </w:rPr>
-        <w:t>Աշխատանքի</w:t>
-      </w:r>
-      <w:r>
-        <w:rPr>
-          <w:rFonts w:ascii="Sylfaen" w:hAnsi="Sylfaen" w:cs="Arial Armenian"/>
-          <w:lang w:val="hy-AM"/>
-        </w:rPr>
-        <w:t xml:space="preserve"> </w:t>
-      </w:r>
-      <w:r>
-        <w:rPr>
-          <w:rFonts w:ascii="Sylfaen" w:hAnsi="Sylfaen" w:cs="Sylfaen"/>
-          <w:lang w:val="hy-AM"/>
-        </w:rPr>
-        <w:t>նախնական</w:t>
-      </w:r>
-      <w:r>
-        <w:rPr>
-          <w:rFonts w:ascii="Sylfaen" w:hAnsi="Sylfaen" w:cs="Arial Armenian"/>
-          <w:lang w:val="hy-AM"/>
-        </w:rPr>
-        <w:t xml:space="preserve"> </w:t>
-      </w:r>
-      <w:r>
-        <w:rPr>
-          <w:rFonts w:ascii="Sylfaen" w:hAnsi="Sylfaen" w:cs="Sylfaen"/>
-          <w:lang w:val="hy-AM"/>
-        </w:rPr>
-        <w:t>տվյալները</w:t>
-      </w:r>
-      <w:r>
-        <w:rPr>
-          <w:rFonts w:ascii="Sylfaen" w:hAnsi="Sylfaen"/>
+          <w:rFonts w:ascii="Times New Roman" w:hAnsi="Times New Roman"/>
+          <w:sz w:val="20"/>
+          <w:szCs w:val="20"/>
+          <w:lang w:val="hy-AM"/>
+        </w:rPr>
+      </w:pPr>
+      <w:r>
+        <w:rPr>
+          <w:rFonts w:ascii="Times New Roman" w:hAnsi="Times New Roman"/>
+          <w:sz w:val="20"/>
+          <w:szCs w:val="20"/>
+          <w:lang w:val="hy-AM"/>
+        </w:rPr>
+        <w:t>2. Աշխատանքի նախնական տվյալները</w:t>
+      </w:r>
+      <w:r>
+        <w:rPr>
+          <w:rFonts w:ascii="Times New Roman" w:hAnsi="Times New Roman"/>
+          <w:sz w:val="20"/>
+          <w:szCs w:val="20"/>
           <w:lang w:val="hy-AM"/>
         </w:rPr>
         <w:t xml:space="preserve"> </w:t>
@@ -2789,599 +2951,193 @@
           <w:rFonts w:ascii="Times New Roman" w:hAnsi="Times New Roman"/>
           <w:i/>
           <w:iCs/>
-          <w:color w:val="0070C0"/>
-          <w:u w:val="single"/>
-          <w:lang w:val="hy-AM"/>
-        </w:rPr>
-        <w:t xml:space="preserve">Աշխատանքի իրագործման համար ուսումնասիրվել է </w:t>
+          <w:color w:val="000000" w:themeColor="text1"/>
+          <w:sz w:val="20"/>
+          <w:szCs w:val="20"/>
+          <w:u w:val="single"/>
+          <w:lang w:val="hy-AM"/>
+        </w:rPr>
+        <w:t>Աշխատանքի իրագործման համար ուսումնասիրվել է learn.microsoft.com և databricks.com/learn հարթակների կողմից տրամադրված ամպային տեխնոլոգիաններ մեծ տվյալների մշակման համար առաջարկվող</w:t>
       </w:r>
       <w:r>
         <w:rPr>
           <w:rFonts w:ascii="Times New Roman" w:hAnsi="Times New Roman"/>
           <w:i/>
           <w:iCs/>
-          <w:color w:val="0070C0"/>
-          <w:u w:val="single"/>
-          <w:lang w:val="hy-AM"/>
-        </w:rPr>
-        <w:t>learn.microsoft.com</w:t>
+          <w:color w:val="000000" w:themeColor="text1"/>
+          <w:sz w:val="20"/>
+          <w:szCs w:val="20"/>
+          <w:u w:val="single"/>
+          <w:lang w:val="hy-AM"/>
+        </w:rPr>
+        <w:t>,</w:t>
       </w:r>
       <w:r>
         <w:rPr>
           <w:rFonts w:ascii="Times New Roman" w:hAnsi="Times New Roman"/>
           <w:i/>
           <w:iCs/>
-          <w:color w:val="0070C0"/>
-          <w:u w:val="single"/>
-          <w:lang w:val="hy-AM"/>
-        </w:rPr>
-        <w:t xml:space="preserve"> և </w:t>
+          <w:color w:val="000000" w:themeColor="text1"/>
+          <w:sz w:val="20"/>
+          <w:szCs w:val="20"/>
+          <w:u w:val="single"/>
+          <w:lang w:val="hy-AM"/>
+        </w:rPr>
+        <w:t xml:space="preserve"> ժամանակակից մեթոդների</w:t>
       </w:r>
       <w:r>
         <w:rPr>
           <w:rFonts w:ascii="Times New Roman" w:hAnsi="Times New Roman"/>
           <w:i/>
           <w:iCs/>
-          <w:color w:val="0070C0"/>
-          <w:u w:val="single"/>
-          <w:lang w:val="hy-AM"/>
-        </w:rPr>
-        <w:t>databricks.com/learn</w:t>
+          <w:color w:val="000000" w:themeColor="text1"/>
+          <w:sz w:val="20"/>
+          <w:szCs w:val="20"/>
+          <w:u w:val="single"/>
+          <w:lang w:val="hy-AM"/>
+        </w:rPr>
+        <w:t>ը</w:t>
       </w:r>
       <w:r>
         <w:rPr>
           <w:rFonts w:ascii="Times New Roman" w:hAnsi="Times New Roman"/>
           <w:i/>
           <w:iCs/>
-          <w:color w:val="0070C0"/>
-          <w:u w:val="single"/>
-          <w:lang w:val="hy-AM"/>
-        </w:rPr>
-        <w:t xml:space="preserve"> հարթակների կողմից տրամադրված ամպային տեխնոլոգիաններ մեծ տվյալների մշակման համար առաջարկվող</w:t>
+          <w:color w:val="000000" w:themeColor="text1"/>
+          <w:sz w:val="20"/>
+          <w:szCs w:val="20"/>
+          <w:u w:val="single"/>
+          <w:lang w:val="hy-AM"/>
+        </w:rPr>
+        <w:t>, ճարտարապետությունները և գործիքակազմերը նկարագրող նյութերը։</w:t>
+      </w:r>
+    </w:p>
+    <w:p>
+      <w:pPr>
+        <w:ind w:firstLine="0"/>
+        <w:rPr>
+          <w:rFonts w:ascii="Times New Roman" w:hAnsi="Times New Roman"/>
+          <w:sz w:val="20"/>
+          <w:szCs w:val="20"/>
+          <w:lang w:val="hy-AM"/>
+        </w:rPr>
+      </w:pPr>
+      <w:r>
+        <w:rPr>
+          <w:rFonts w:ascii="Times New Roman" w:hAnsi="Times New Roman"/>
+          <w:sz w:val="20"/>
+          <w:szCs w:val="20"/>
+          <w:lang w:val="hy-AM"/>
+        </w:rPr>
+        <w:t xml:space="preserve">3. Հաշվեբացատրագրի բովանդակությունը (բաժինների և մշակման ենթակա հարցերի թվարկմամբ) </w:t>
       </w:r>
       <w:r>
         <w:rPr>
           <w:rFonts w:ascii="Times New Roman" w:hAnsi="Times New Roman"/>
           <w:i/>
           <w:iCs/>
-          <w:color w:val="0070C0"/>
-          <w:u w:val="single"/>
-          <w:lang w:val="hy-AM"/>
-        </w:rPr>
-        <w:t>,</w:t>
+          <w:color w:val="000000" w:themeColor="text1"/>
+          <w:sz w:val="20"/>
+          <w:szCs w:val="20"/>
+          <w:u w:val="single"/>
+          <w:lang w:val="hy-AM"/>
+        </w:rPr>
+        <w:t>Ավարտական աշխատանքը իր մեջ ներառում է ժամանակակից ամպային ենթակառուցվածքների միջոցով մեծ տվյալների համար ETL/ELT խողովակաշարերի կառուցումը։ Աշխատանքը իրականացնելու համար որպես ամպային հարթակ ընտրվել է Microsoft Azure-ը</w:t>
       </w:r>
       <w:r>
         <w:rPr>
           <w:rFonts w:ascii="Times New Roman" w:hAnsi="Times New Roman"/>
           <w:i/>
           <w:iCs/>
-          <w:color w:val="0070C0"/>
-          <w:u w:val="single"/>
-          <w:lang w:val="hy-AM"/>
-        </w:rPr>
-        <w:t xml:space="preserve"> ժամանակակից մեթոդների</w:t>
+          <w:color w:val="000000" w:themeColor="text1"/>
+          <w:sz w:val="20"/>
+          <w:szCs w:val="20"/>
+          <w:u w:val="single"/>
+          <w:lang w:val="hy-AM"/>
+        </w:rPr>
+        <w:t xml:space="preserve"> և այդ հարթակի ռեսուրսներից առաջադրված խնդրի իրականացման համար ընտրվել են Microsoft Azure Data Factory, Azure Synapse, Azure Databrics և այլ</w:t>
       </w:r>
       <w:r>
         <w:rPr>
           <w:rFonts w:ascii="Times New Roman" w:hAnsi="Times New Roman"/>
           <w:i/>
           <w:iCs/>
-          <w:color w:val="0070C0"/>
-          <w:u w:val="single"/>
-          <w:lang w:val="hy-AM"/>
-        </w:rPr>
-        <w:t>ը</w:t>
+          <w:color w:val="000000" w:themeColor="text1"/>
+          <w:sz w:val="20"/>
+          <w:szCs w:val="20"/>
+          <w:u w:val="single"/>
+          <w:lang w:val="hy-AM"/>
+        </w:rPr>
+        <w:t>ն</w:t>
       </w:r>
       <w:r>
         <w:rPr>
           <w:rFonts w:ascii="Times New Roman" w:hAnsi="Times New Roman"/>
           <w:i/>
           <w:iCs/>
-          <w:color w:val="0070C0"/>
-          <w:u w:val="single"/>
-          <w:lang w:val="hy-AM"/>
-        </w:rPr>
-        <w:t>, ճարտարապետությունները և գործիքակազմերը նկարագրող նյութերը։</w:t>
+          <w:color w:val="000000" w:themeColor="text1"/>
+          <w:sz w:val="20"/>
+          <w:szCs w:val="20"/>
+          <w:u w:val="single"/>
+          <w:lang w:val="hy-AM"/>
+        </w:rPr>
+        <w:t>։ Տեխնոլոգիական իրականացումը ապահովելու է մեծ տվյալների համար ECL գործակցի հաշվման գործընթացի ավտոմատացումը։</w:t>
       </w:r>
     </w:p>
     <w:p>
       <w:pPr>
-        <w:ind w:firstLine="0"/>
-        <w:rPr>
-          <w:rFonts w:ascii="Sylfaen" w:hAnsi="Sylfaen"/>
-          <w:lang w:val="hy-AM"/>
-        </w:rPr>
-      </w:pPr>
-      <w:r>
-        <w:rPr>
-          <w:rFonts w:ascii="Sylfaen" w:hAnsi="Sylfaen"/>
-          <w:lang w:val="hy-AM"/>
-        </w:rPr>
-        <w:t xml:space="preserve">3. </w:t>
-      </w:r>
-      <w:r>
-        <w:rPr>
-          <w:rFonts w:ascii="Sylfaen" w:hAnsi="Sylfaen" w:cs="Sylfaen"/>
-          <w:lang w:val="hy-AM"/>
-        </w:rPr>
-        <w:t>Հաշվեբացատրագրի</w:t>
-      </w:r>
-      <w:r>
-        <w:rPr>
-          <w:rFonts w:ascii="Sylfaen" w:hAnsi="Sylfaen" w:cs="Arial Armenian"/>
-          <w:lang w:val="hy-AM"/>
-        </w:rPr>
-        <w:t xml:space="preserve"> </w:t>
-      </w:r>
-      <w:r>
-        <w:rPr>
-          <w:rFonts w:ascii="Sylfaen" w:hAnsi="Sylfaen" w:cs="Sylfaen"/>
-          <w:lang w:val="hy-AM"/>
-        </w:rPr>
-        <w:t>բովանդակությունը</w:t>
-      </w:r>
-      <w:r>
-        <w:rPr>
-          <w:rFonts w:ascii="Sylfaen" w:hAnsi="Sylfaen" w:cs="Arial Armenian"/>
-          <w:lang w:val="hy-AM"/>
-        </w:rPr>
-        <w:t xml:space="preserve"> (</w:t>
-      </w:r>
-      <w:r>
-        <w:rPr>
-          <w:rFonts w:ascii="Sylfaen" w:hAnsi="Sylfaen" w:cs="Sylfaen"/>
-          <w:lang w:val="hy-AM"/>
-        </w:rPr>
-        <w:t>բաժինների</w:t>
-      </w:r>
-      <w:r>
-        <w:rPr>
-          <w:rFonts w:ascii="Sylfaen" w:hAnsi="Sylfaen" w:cs="Arial Armenian"/>
-          <w:lang w:val="hy-AM"/>
-        </w:rPr>
-        <w:t xml:space="preserve"> </w:t>
-      </w:r>
-      <w:r>
-        <w:rPr>
-          <w:rFonts w:ascii="Sylfaen" w:hAnsi="Sylfaen" w:cs="Sylfaen"/>
-          <w:lang w:val="hy-AM"/>
-        </w:rPr>
-        <w:t>և</w:t>
-      </w:r>
-      <w:r>
-        <w:rPr>
-          <w:rFonts w:ascii="Sylfaen" w:hAnsi="Sylfaen" w:cs="Arial Armenian"/>
-          <w:lang w:val="hy-AM"/>
-        </w:rPr>
-        <w:t xml:space="preserve"> </w:t>
-      </w:r>
-      <w:r>
-        <w:rPr>
-          <w:rFonts w:ascii="Sylfaen" w:hAnsi="Sylfaen" w:cs="Sylfaen"/>
-          <w:lang w:val="hy-AM"/>
-        </w:rPr>
-        <w:t>մշակման</w:t>
-      </w:r>
-      <w:r>
-        <w:rPr>
-          <w:rFonts w:ascii="Sylfaen" w:hAnsi="Sylfaen" w:cs="Arial Armenian"/>
-          <w:lang w:val="hy-AM"/>
-        </w:rPr>
-        <w:t xml:space="preserve"> </w:t>
-      </w:r>
-      <w:r>
-        <w:rPr>
-          <w:rFonts w:ascii="Sylfaen" w:hAnsi="Sylfaen" w:cs="Sylfaen"/>
-          <w:lang w:val="hy-AM"/>
-        </w:rPr>
-        <w:t>ենթակա</w:t>
-      </w:r>
-      <w:r>
-        <w:rPr>
-          <w:rFonts w:ascii="Sylfaen" w:hAnsi="Sylfaen" w:cs="Arial Armenian"/>
-          <w:lang w:val="hy-AM"/>
-        </w:rPr>
-        <w:t xml:space="preserve"> </w:t>
-      </w:r>
-      <w:r>
-        <w:rPr>
-          <w:rFonts w:ascii="Sylfaen" w:hAnsi="Sylfaen" w:cs="Sylfaen"/>
-          <w:lang w:val="hy-AM"/>
-        </w:rPr>
-        <w:t>հարցերի</w:t>
-      </w:r>
-      <w:r>
-        <w:rPr>
-          <w:rFonts w:ascii="Sylfaen" w:hAnsi="Sylfaen" w:cs="Arial Armenian"/>
-          <w:lang w:val="hy-AM"/>
-        </w:rPr>
-        <w:t xml:space="preserve"> </w:t>
-      </w:r>
-      <w:r>
-        <w:rPr>
-          <w:rFonts w:ascii="Sylfaen" w:hAnsi="Sylfaen" w:cs="Sylfaen"/>
-          <w:lang w:val="hy-AM"/>
-        </w:rPr>
-        <w:t>թվարկմամբ</w:t>
-      </w:r>
-      <w:r>
-        <w:rPr>
-          <w:rFonts w:ascii="Sylfaen" w:hAnsi="Sylfaen" w:cs="Arial Armenian"/>
-          <w:lang w:val="hy-AM"/>
-        </w:rPr>
-        <w:t xml:space="preserve">) </w:t>
-      </w:r>
+        <w:spacing w:before="240"/>
+        <w:ind w:right="-143" w:firstLine="0"/>
+        <w:rPr>
+          <w:rFonts w:ascii="Times New Roman" w:hAnsi="Times New Roman"/>
+          <w:sz w:val="20"/>
+          <w:szCs w:val="20"/>
+          <w:lang w:val="hy-AM"/>
+        </w:rPr>
+      </w:pPr>
+      <w:r>
+        <w:rPr>
+          <w:rFonts w:ascii="Times New Roman" w:hAnsi="Times New Roman"/>
+          <w:sz w:val="20"/>
+          <w:szCs w:val="20"/>
+          <w:lang w:val="hy-AM"/>
+        </w:rPr>
+        <w:t>4. Գրաֆիկական մասի ծավալը (պարտադիր գծագրերի թվարկմամբ)</w:t>
+      </w:r>
+    </w:p>
+    <w:p>
+      <w:pPr>
+        <w:spacing w:before="240"/>
+        <w:ind w:right="-143" w:firstLine="0"/>
+        <w:rPr>
+          <w:rFonts w:ascii="Times New Roman" w:hAnsi="Times New Roman"/>
+          <w:color w:val="000000" w:themeColor="text1"/>
+          <w:sz w:val="20"/>
+          <w:szCs w:val="20"/>
+          <w:lang w:val="hy-AM"/>
+        </w:rPr>
+      </w:pPr>
       <w:r>
         <w:rPr>
           <w:rFonts w:ascii="Times New Roman" w:hAnsi="Times New Roman"/>
           <w:i/>
           <w:iCs/>
-          <w:color w:val="0070C0"/>
-          <w:u w:val="single"/>
-          <w:lang w:val="hy-AM"/>
-        </w:rPr>
-        <w:t xml:space="preserve">Ավարտական աշխատանքը իր մեջ ներառում է ժամանակակից ամպային ենթակառուցվածքների միջոցով մեծ տվյալների համար </w:t>
+          <w:color w:val="000000" w:themeColor="text1"/>
+          <w:sz w:val="20"/>
+          <w:szCs w:val="20"/>
+          <w:u w:val="single"/>
+          <w:lang w:val="hy-AM"/>
+        </w:rPr>
+        <w:t>Ա</w:t>
       </w:r>
       <w:r>
         <w:rPr>
           <w:rFonts w:ascii="Times New Roman" w:hAnsi="Times New Roman"/>
           <w:i/>
           <w:iCs/>
-          <w:color w:val="0070C0"/>
-          <w:u w:val="single"/>
-          <w:lang w:val="hy-AM"/>
-        </w:rPr>
-        <w:t>ETL/ELT</w:t>
-      </w:r>
-      <w:r>
-        <w:rPr>
-          <w:rFonts w:ascii="Times New Roman" w:hAnsi="Times New Roman"/>
-          <w:i/>
-          <w:iCs/>
-          <w:color w:val="0070C0"/>
-          <w:u w:val="single"/>
-          <w:lang w:val="hy-AM"/>
-        </w:rPr>
-        <w:t xml:space="preserve"> խողովակաշարերի կառուցումը, մեծ տվյալների զտման համար նախատեսված </w:t>
-      </w:r>
-      <w:r>
-        <w:rPr>
-          <w:rFonts w:ascii="Times New Roman" w:hAnsi="Times New Roman"/>
-          <w:i/>
-          <w:iCs/>
-          <w:color w:val="0070C0"/>
-          <w:u w:val="single"/>
-          <w:lang w:val="hy-AM"/>
-        </w:rPr>
-        <w:t>«</w:t>
-      </w:r>
-      <w:r>
-        <w:rPr>
-          <w:rFonts w:ascii="Times New Roman" w:hAnsi="Times New Roman"/>
-          <w:i/>
-          <w:iCs/>
-          <w:color w:val="0070C0"/>
-          <w:u w:val="single"/>
-          <w:lang w:val="hy-AM"/>
-        </w:rPr>
-        <w:t>մ</w:t>
-      </w:r>
-      <w:r>
-        <w:rPr>
-          <w:rFonts w:ascii="Times New Roman" w:hAnsi="Times New Roman"/>
-          <w:i/>
-          <w:iCs/>
-          <w:color w:val="0070C0"/>
-          <w:u w:val="single"/>
-          <w:lang w:val="hy-AM"/>
-        </w:rPr>
-        <w:t xml:space="preserve">եդալիոն» </w:t>
-      </w:r>
-      <w:r>
-        <w:rPr>
-          <w:rFonts w:ascii="Times New Roman" w:hAnsi="Times New Roman"/>
-          <w:i/>
-          <w:iCs/>
-          <w:color w:val="0070C0"/>
-          <w:u w:val="single"/>
-          <w:lang w:val="hy-AM"/>
-        </w:rPr>
-        <w:t>ճ</w:t>
-      </w:r>
-      <w:r>
-        <w:rPr>
-          <w:rFonts w:ascii="Times New Roman" w:hAnsi="Times New Roman"/>
-          <w:i/>
-          <w:iCs/>
-          <w:color w:val="0070C0"/>
-          <w:u w:val="single"/>
-          <w:lang w:val="hy-AM"/>
-        </w:rPr>
-        <w:t>արտարապետությ</w:t>
-      </w:r>
-      <w:r>
-        <w:rPr>
-          <w:rFonts w:ascii="Times New Roman" w:hAnsi="Times New Roman"/>
-          <w:i/>
-          <w:iCs/>
-          <w:color w:val="0070C0"/>
-          <w:u w:val="single"/>
-          <w:lang w:val="hy-AM"/>
-        </w:rPr>
-        <w:t>ա</w:t>
-      </w:r>
-      <w:r>
-        <w:rPr>
-          <w:rFonts w:ascii="Times New Roman" w:hAnsi="Times New Roman"/>
-          <w:i/>
-          <w:iCs/>
-          <w:color w:val="0070C0"/>
-          <w:u w:val="single"/>
-          <w:lang w:val="hy-AM"/>
-        </w:rPr>
-        <w:t>ն</w:t>
-      </w:r>
-      <w:r>
-        <w:rPr>
-          <w:rFonts w:ascii="Times New Roman" w:hAnsi="Times New Roman"/>
-          <w:i/>
-          <w:iCs/>
-          <w:color w:val="0070C0"/>
-          <w:u w:val="single"/>
-          <w:lang w:val="hy-AM"/>
-        </w:rPr>
-        <w:t xml:space="preserve"> իրականացումը, ուսումնասիրությություններ </w:t>
-      </w:r>
-      <w:r>
-        <w:rPr>
-          <w:rFonts w:ascii="Times New Roman" w:hAnsi="Times New Roman"/>
-          <w:i/>
-          <w:iCs/>
-          <w:color w:val="0070C0"/>
-          <w:u w:val="single"/>
-          <w:lang w:val="hy-AM"/>
-        </w:rPr>
-        <w:t>OLTP/OLAP</w:t>
-      </w:r>
-      <w:r>
-        <w:rPr>
-          <w:rFonts w:ascii="Times New Roman" w:hAnsi="Times New Roman"/>
-          <w:i/>
-          <w:iCs/>
-          <w:color w:val="0070C0"/>
-          <w:u w:val="single"/>
-          <w:lang w:val="hy-AM"/>
-        </w:rPr>
-        <w:t xml:space="preserve"> համակարգերի կիրառություններ։ Աշխատանքը իրականացնելու համար որպես ամպային</w:t>
-      </w:r>
-      <w:r>
-        <w:rPr>
-          <w:rFonts w:ascii="Times New Roman" w:hAnsi="Times New Roman"/>
-          <w:i/>
-          <w:iCs/>
-          <w:color w:val="0070C0"/>
-          <w:u w:val="single"/>
-          <w:lang w:val="hy-AM"/>
-        </w:rPr>
-        <w:t xml:space="preserve"> հաշվարկման հարթակ</w:t>
-      </w:r>
-      <w:r>
-        <w:rPr>
-          <w:rFonts w:ascii="Times New Roman" w:hAnsi="Times New Roman"/>
-          <w:i/>
-          <w:iCs/>
-          <w:color w:val="0070C0"/>
-          <w:u w:val="single"/>
-          <w:lang w:val="hy-AM"/>
-        </w:rPr>
-        <w:t xml:space="preserve"> ընտրվել է </w:t>
-      </w:r>
-      <w:r>
-        <w:rPr>
-          <w:rFonts w:ascii="Times New Roman" w:hAnsi="Times New Roman"/>
-          <w:i/>
-          <w:iCs/>
-          <w:color w:val="0070C0"/>
-          <w:u w:val="single"/>
-          <w:lang w:val="hy-AM"/>
-        </w:rPr>
-        <w:t>Mic</w:t>
-      </w:r>
-      <w:r>
-        <w:rPr>
-          <w:rFonts w:ascii="Times New Roman" w:hAnsi="Times New Roman"/>
-          <w:i/>
-          <w:iCs/>
-          <w:color w:val="0070C0"/>
-          <w:u w:val="single"/>
-          <w:lang w:val="hy-AM"/>
-        </w:rPr>
-        <w:t>rosoft Azure-ը</w:t>
-      </w:r>
-      <w:r>
-        <w:rPr>
-          <w:rFonts w:ascii="Times New Roman" w:hAnsi="Times New Roman"/>
-          <w:i/>
-          <w:iCs/>
-          <w:color w:val="0070C0"/>
-          <w:u w:val="single"/>
-          <w:lang w:val="hy-AM"/>
-        </w:rPr>
-        <w:t xml:space="preserve"> և այդ հարթակի ռեսուրսներից առաջադրված խնդրի իրականացման համար ընտրվել են </w:t>
-      </w:r>
-      <w:r>
-        <w:rPr>
-          <w:rFonts w:ascii="Times New Roman" w:hAnsi="Times New Roman"/>
-          <w:i/>
-          <w:iCs/>
-          <w:color w:val="0070C0"/>
-          <w:u w:val="single"/>
-          <w:lang w:val="hy-AM"/>
-        </w:rPr>
-        <w:t>M</w:t>
-      </w:r>
-      <w:r>
-        <w:rPr>
-          <w:rFonts w:ascii="Times New Roman" w:hAnsi="Times New Roman"/>
-          <w:i/>
-          <w:iCs/>
-          <w:color w:val="0070C0"/>
-          <w:u w:val="single"/>
-          <w:lang w:val="hy-AM"/>
-        </w:rPr>
-        <w:t xml:space="preserve">icrosoft Azure Data Factory, Azure Synapse, Azure Databrics և այլ հարակից ռեսուրսներ տվյալների պահոցի (Data Lake)-ի նախագծման համար։ Տեխնոլոգիական իրականացումը ապահովելու է մեծ տվյալների համար </w:t>
-      </w:r>
-      <w:r>
-        <w:rPr>
-          <w:rFonts w:ascii="Times New Roman" w:hAnsi="Times New Roman"/>
-          <w:i/>
-          <w:iCs/>
-          <w:color w:val="0070C0"/>
-          <w:u w:val="single"/>
-          <w:lang w:val="hy-AM"/>
-        </w:rPr>
-        <w:t xml:space="preserve">ECL գործակցի հաշվման </w:t>
-      </w:r>
-      <w:r>
-        <w:rPr>
-          <w:rFonts w:ascii="Times New Roman" w:hAnsi="Times New Roman"/>
-          <w:i/>
-          <w:iCs/>
-          <w:color w:val="0070C0"/>
-          <w:u w:val="single"/>
-          <w:lang w:val="hy-AM"/>
-        </w:rPr>
-        <w:t>գործընթացի ավտոմատացումը։</w:t>
-      </w:r>
-    </w:p>
-    <w:p>
-      <w:pPr>
-        <w:spacing w:before="240"/>
-        <w:ind w:right="-143" w:firstLine="0"/>
-        <w:rPr>
-          <w:rFonts w:ascii="Sylfaen" w:hAnsi="Sylfaen"/>
-          <w:lang w:val="hy-AM"/>
-        </w:rPr>
-      </w:pPr>
-      <w:r>
-        <w:rPr>
-          <w:rFonts w:ascii="Sylfaen" w:hAnsi="Sylfaen"/>
-          <w:lang w:val="hy-AM"/>
-        </w:rPr>
-        <w:lastRenderedPageBreak/>
-        <w:t xml:space="preserve">4. </w:t>
-      </w:r>
-      <w:r>
-        <w:rPr>
-          <w:rFonts w:ascii="Sylfaen" w:hAnsi="Sylfaen" w:cs="Sylfaen"/>
-          <w:lang w:val="hy-AM"/>
-        </w:rPr>
-        <w:t>Գրաֆիկական</w:t>
-      </w:r>
-      <w:r>
-        <w:rPr>
-          <w:rFonts w:ascii="Sylfaen" w:hAnsi="Sylfaen" w:cs="Arial Armenian"/>
-          <w:lang w:val="hy-AM"/>
-        </w:rPr>
-        <w:t xml:space="preserve"> </w:t>
-      </w:r>
-      <w:r>
-        <w:rPr>
-          <w:rFonts w:ascii="Sylfaen" w:hAnsi="Sylfaen" w:cs="Sylfaen"/>
-          <w:lang w:val="hy-AM"/>
-        </w:rPr>
-        <w:t>մասի</w:t>
-      </w:r>
-      <w:r>
-        <w:rPr>
-          <w:rFonts w:ascii="Sylfaen" w:hAnsi="Sylfaen" w:cs="Arial Armenian"/>
-          <w:lang w:val="hy-AM"/>
-        </w:rPr>
-        <w:t xml:space="preserve"> </w:t>
-      </w:r>
-      <w:r>
-        <w:rPr>
-          <w:rFonts w:ascii="Sylfaen" w:hAnsi="Sylfaen" w:cs="Sylfaen"/>
-          <w:lang w:val="hy-AM"/>
-        </w:rPr>
-        <w:t>ծավալը</w:t>
-      </w:r>
-      <w:r>
-        <w:rPr>
-          <w:rFonts w:ascii="Sylfaen" w:hAnsi="Sylfaen" w:cs="Arial Armenian"/>
-          <w:lang w:val="hy-AM"/>
-        </w:rPr>
-        <w:t xml:space="preserve"> (</w:t>
-      </w:r>
-      <w:r>
-        <w:rPr>
-          <w:rFonts w:ascii="Sylfaen" w:hAnsi="Sylfaen" w:cs="Sylfaen"/>
-          <w:lang w:val="hy-AM"/>
-        </w:rPr>
-        <w:t>պարտադիր</w:t>
-      </w:r>
-      <w:r>
-        <w:rPr>
-          <w:rFonts w:ascii="Sylfaen" w:hAnsi="Sylfaen" w:cs="Arial Armenian"/>
-          <w:lang w:val="hy-AM"/>
-        </w:rPr>
-        <w:t xml:space="preserve"> </w:t>
-      </w:r>
-      <w:r>
-        <w:rPr>
-          <w:rFonts w:ascii="Sylfaen" w:hAnsi="Sylfaen" w:cs="Sylfaen"/>
-          <w:lang w:val="hy-AM"/>
-        </w:rPr>
-        <w:t>գծագրերի</w:t>
-      </w:r>
-      <w:r>
-        <w:rPr>
-          <w:rFonts w:ascii="Sylfaen" w:hAnsi="Sylfaen" w:cs="Arial Armenian"/>
-          <w:lang w:val="hy-AM"/>
-        </w:rPr>
-        <w:t xml:space="preserve"> </w:t>
-      </w:r>
-      <w:r>
-        <w:rPr>
-          <w:rFonts w:ascii="Sylfaen" w:hAnsi="Sylfaen" w:cs="Sylfaen"/>
-          <w:lang w:val="hy-AM"/>
-        </w:rPr>
-        <w:t>թվարկմամբ</w:t>
-      </w:r>
-      <w:r>
-        <w:rPr>
-          <w:rFonts w:ascii="Sylfaen" w:hAnsi="Sylfaen"/>
-          <w:lang w:val="hy-AM"/>
-        </w:rPr>
-        <w:t>)</w:t>
-      </w:r>
-    </w:p>
-    <w:p>
-      <w:pPr>
-        <w:spacing w:before="240"/>
-        <w:ind w:right="-143" w:firstLine="0"/>
-        <w:rPr>
-          <w:rFonts w:ascii="Sylfaen" w:hAnsi="Sylfaen" w:cs="Arial Armenian"/>
-          <w:lang w:val="hy-AM"/>
-        </w:rPr>
-      </w:pPr>
-      <w:r>
-        <w:rPr>
-          <w:rFonts w:ascii="Times New Roman" w:hAnsi="Times New Roman"/>
-          <w:i/>
-          <w:iCs/>
-          <w:color w:val="0070C0"/>
-          <w:u w:val="single"/>
-          <w:lang w:val="hy-AM"/>
-        </w:rPr>
-        <w:t>Ա</w:t>
-      </w:r>
-      <w:r>
-        <w:rPr>
-          <w:rFonts w:ascii="Times New Roman" w:hAnsi="Times New Roman"/>
-          <w:i/>
-          <w:iCs/>
-          <w:color w:val="0070C0"/>
+          <w:color w:val="000000" w:themeColor="text1"/>
+          <w:sz w:val="20"/>
+          <w:szCs w:val="20"/>
           <w:u w:val="single"/>
           <w:lang w:val="hy-AM"/>
         </w:rPr>
@@ -3467,21 +3223,12 @@
           <w:rFonts w:ascii="Sylfaen" w:hAnsi="Sylfaen" w:cs="Sylfaen"/>
           <w:lang w:val="hy-AM"/>
         </w:rPr>
-        <w:t>պլա</w:t>
-      </w:r>
-      <w:bookmarkStart w:id="3" w:name="_GoBack"/>
-      <w:bookmarkEnd w:id="3"/>
-      <w:r>
-        <w:rPr>
-          <w:rFonts w:ascii="Sylfaen" w:hAnsi="Sylfaen" w:cs="Sylfaen"/>
-          <w:lang w:val="hy-AM"/>
-        </w:rPr>
-        <w:t>ն</w:t>
+        <w:t>պլան</w:t>
       </w:r>
     </w:p>
     <w:tbl>
       <w:tblPr>
-        <w:tblW w:w="4944" w:type="pct"/>
+        <w:tblW w:w="4936" w:type="pct"/>
         <w:tblInd w:w="562" w:type="dxa"/>
         <w:tblBorders>
           <w:top w:val="single" w:sz="4" w:space="0" w:color="auto"/>
@@ -3494,15 +3241,15 @@
         <w:tblLook w:val="01E0" w:firstRow="1" w:lastRow="1" w:firstColumn="1" w:lastColumn="1" w:noHBand="0" w:noVBand="0"/>
       </w:tblPr>
       <w:tblGrid>
-        <w:gridCol w:w="603"/>
-        <w:gridCol w:w="4075"/>
-        <w:gridCol w:w="1418"/>
-        <w:gridCol w:w="1559"/>
-        <w:gridCol w:w="1590"/>
+        <w:gridCol w:w="602"/>
+        <w:gridCol w:w="4068"/>
+        <w:gridCol w:w="1416"/>
+        <w:gridCol w:w="1556"/>
+        <w:gridCol w:w="1588"/>
       </w:tblGrid>
       <w:tr>
         <w:trPr>
-          <w:trHeight w:val="380"/>
+          <w:trHeight w:val="324"/>
         </w:trPr>
         <w:tc>
           <w:tcPr>
@@ -3569,6 +3316,7 @@
           </w:tcPr>
           <w:p>
             <w:pPr>
+              <w:ind w:firstLine="0"/>
               <w:jc w:val="center"/>
               <w:rPr>
                 <w:rFonts w:ascii="Sylfaen" w:hAnsi="Sylfaen"/>
@@ -3639,7 +3387,7 @@
       </w:tr>
       <w:tr>
         <w:trPr>
-          <w:trHeight w:val="380"/>
+          <w:trHeight w:val="324"/>
         </w:trPr>
         <w:tc>
           <w:tcPr>
@@ -3774,7 +3522,7 @@
       </w:tr>
       <w:tr>
         <w:trPr>
-          <w:trHeight w:val="480"/>
+          <w:trHeight w:val="410"/>
         </w:trPr>
         <w:tc>
           <w:tcPr>
@@ -3849,7 +3597,7 @@
       </w:tr>
       <w:tr>
         <w:trPr>
-          <w:trHeight w:val="480"/>
+          <w:trHeight w:val="387"/>
         </w:trPr>
         <w:tc>
           <w:tcPr>
@@ -3924,7 +3672,7 @@
       </w:tr>
       <w:tr>
         <w:trPr>
-          <w:trHeight w:val="480"/>
+          <w:trHeight w:val="410"/>
         </w:trPr>
         <w:tc>
           <w:tcPr>
@@ -4033,7 +3781,7 @@
       </w:tr>
       <w:tr>
         <w:trPr>
-          <w:trHeight w:val="480"/>
+          <w:trHeight w:val="410"/>
         </w:trPr>
         <w:tc>
           <w:tcPr>
@@ -4055,6 +3803,7 @@
           </w:tcPr>
           <w:p>
             <w:pPr>
+              <w:ind w:firstLine="0"/>
               <w:jc w:val="center"/>
               <w:rPr>
                 <w:rFonts w:ascii="Sylfaen" w:hAnsi="Sylfaen"/>
@@ -4062,6 +3811,15 @@
                 <w:lang w:val="hy-AM"/>
               </w:rPr>
             </w:pPr>
+            <w:r>
+              <w:rPr>
+                <w:rFonts w:ascii="Sylfaen" w:hAnsi="Sylfaen"/>
+                <w:sz w:val="18"/>
+                <w:szCs w:val="28"/>
+                <w:lang w:val="hy-AM"/>
+              </w:rPr>
+              <w:t>Մեծ տվյալների մշակման համար ամպային տեխնոլոգիաների ուսումսանիրում</w:t>
+            </w:r>
           </w:p>
         </w:tc>
         <w:tc>
@@ -4109,83 +3867,7 @@
       </w:tr>
       <w:tr>
         <w:trPr>
-          <w:trHeight w:val="480"/>
-        </w:trPr>
-        <w:tc>
-          <w:tcPr>
-            <w:tcW w:w="326" w:type="pct"/>
-          </w:tcPr>
-          <w:p>
-            <w:pPr>
-              <w:jc w:val="center"/>
-              <w:rPr>
-                <w:rFonts w:ascii="Sylfaen" w:hAnsi="Sylfaen"/>
-                <w:lang w:val="hy-AM"/>
-              </w:rPr>
-            </w:pPr>
-          </w:p>
-        </w:tc>
-        <w:tc>
-          <w:tcPr>
-            <w:tcW w:w="2204" w:type="pct"/>
-          </w:tcPr>
-          <w:p>
-            <w:pPr>
-              <w:jc w:val="center"/>
-              <w:rPr>
-                <w:rFonts w:ascii="Sylfaen" w:hAnsi="Sylfaen"/>
-                <w:szCs w:val="28"/>
-                <w:lang w:val="hy-AM"/>
-              </w:rPr>
-            </w:pPr>
-          </w:p>
-        </w:tc>
-        <w:tc>
-          <w:tcPr>
-            <w:tcW w:w="767" w:type="pct"/>
-          </w:tcPr>
-          <w:p>
-            <w:pPr>
-              <w:jc w:val="center"/>
-              <w:rPr>
-                <w:rFonts w:ascii="Sylfaen" w:hAnsi="Sylfaen"/>
-                <w:lang w:val="hy-AM"/>
-              </w:rPr>
-            </w:pPr>
-          </w:p>
-        </w:tc>
-        <w:tc>
-          <w:tcPr>
-            <w:tcW w:w="843" w:type="pct"/>
-          </w:tcPr>
-          <w:p>
-            <w:pPr>
-              <w:jc w:val="center"/>
-              <w:rPr>
-                <w:rFonts w:ascii="Sylfaen" w:hAnsi="Sylfaen"/>
-                <w:lang w:val="hy-AM"/>
-              </w:rPr>
-            </w:pPr>
-          </w:p>
-        </w:tc>
-        <w:tc>
-          <w:tcPr>
-            <w:tcW w:w="860" w:type="pct"/>
-          </w:tcPr>
-          <w:p>
-            <w:pPr>
-              <w:jc w:val="center"/>
-              <w:rPr>
-                <w:rFonts w:ascii="Sylfaen" w:hAnsi="Sylfaen"/>
-                <w:lang w:val="hy-AM"/>
-              </w:rPr>
-            </w:pPr>
-          </w:p>
-        </w:tc>
-      </w:tr>
-      <w:tr>
-        <w:trPr>
-          <w:trHeight w:val="480"/>
+          <w:trHeight w:val="410"/>
         </w:trPr>
         <w:tc>
           <w:tcPr>
@@ -4265,6 +3947,7 @@
               <w:jc w:val="center"/>
               <w:rPr>
                 <w:rFonts w:ascii="Sylfaen" w:hAnsi="Sylfaen"/>
+                <w:sz w:val="20"/>
                 <w:lang w:val="hy-AM"/>
               </w:rPr>
             </w:pPr>
@@ -4296,83 +3979,7 @@
       </w:tr>
       <w:tr>
         <w:trPr>
-          <w:trHeight w:val="480"/>
-        </w:trPr>
-        <w:tc>
-          <w:tcPr>
-            <w:tcW w:w="326" w:type="pct"/>
-          </w:tcPr>
-          <w:p>
-            <w:pPr>
-              <w:jc w:val="center"/>
-              <w:rPr>
-                <w:rFonts w:ascii="Sylfaen" w:hAnsi="Sylfaen"/>
-                <w:lang w:val="hy-AM"/>
-              </w:rPr>
-            </w:pPr>
-          </w:p>
-        </w:tc>
-        <w:tc>
-          <w:tcPr>
-            <w:tcW w:w="2204" w:type="pct"/>
-          </w:tcPr>
-          <w:p>
-            <w:pPr>
-              <w:jc w:val="center"/>
-              <w:rPr>
-                <w:rFonts w:ascii="Sylfaen" w:hAnsi="Sylfaen"/>
-                <w:sz w:val="20"/>
-                <w:lang w:val="hy-AM"/>
-              </w:rPr>
-            </w:pPr>
-          </w:p>
-        </w:tc>
-        <w:tc>
-          <w:tcPr>
-            <w:tcW w:w="767" w:type="pct"/>
-          </w:tcPr>
-          <w:p>
-            <w:pPr>
-              <w:jc w:val="center"/>
-              <w:rPr>
-                <w:rFonts w:ascii="Sylfaen" w:hAnsi="Sylfaen"/>
-                <w:lang w:val="hy-AM"/>
-              </w:rPr>
-            </w:pPr>
-          </w:p>
-        </w:tc>
-        <w:tc>
-          <w:tcPr>
-            <w:tcW w:w="843" w:type="pct"/>
-          </w:tcPr>
-          <w:p>
-            <w:pPr>
-              <w:jc w:val="center"/>
-              <w:rPr>
-                <w:rFonts w:ascii="Sylfaen" w:hAnsi="Sylfaen"/>
-                <w:lang w:val="hy-AM"/>
-              </w:rPr>
-            </w:pPr>
-          </w:p>
-        </w:tc>
-        <w:tc>
-          <w:tcPr>
-            <w:tcW w:w="860" w:type="pct"/>
-          </w:tcPr>
-          <w:p>
-            <w:pPr>
-              <w:jc w:val="center"/>
-              <w:rPr>
-                <w:rFonts w:ascii="Sylfaen" w:hAnsi="Sylfaen"/>
-                <w:lang w:val="hy-AM"/>
-              </w:rPr>
-            </w:pPr>
-          </w:p>
-        </w:tc>
-      </w:tr>
-      <w:tr>
-        <w:trPr>
-          <w:trHeight w:val="480"/>
+          <w:trHeight w:val="410"/>
         </w:trPr>
         <w:tc>
           <w:tcPr>
@@ -4398,6 +4005,201 @@
               <w:jc w:val="center"/>
               <w:rPr>
                 <w:rFonts w:ascii="Sylfaen" w:hAnsi="Sylfaen"/>
+                <w:sz w:val="20"/>
+                <w:lang w:val="hy-AM"/>
+              </w:rPr>
+            </w:pPr>
+            <w:r>
+              <w:rPr>
+                <w:rFonts w:ascii="Sylfaen" w:hAnsi="Sylfaen"/>
+                <w:sz w:val="20"/>
+                <w:lang w:val="hy-AM"/>
+              </w:rPr>
+              <w:t xml:space="preserve">ECL գործակցի </w:t>
+            </w:r>
+            <w:r>
+              <w:rPr>
+                <w:rFonts w:ascii="Sylfaen" w:hAnsi="Sylfaen"/>
+                <w:sz w:val="20"/>
+                <w:lang w:val="hy-AM"/>
+              </w:rPr>
+              <w:t>հաշվարկը առկա տվյալների հիման վրա:</w:t>
+            </w:r>
+          </w:p>
+        </w:tc>
+        <w:tc>
+          <w:tcPr>
+            <w:tcW w:w="767" w:type="pct"/>
+          </w:tcPr>
+          <w:p>
+            <w:pPr>
+              <w:jc w:val="center"/>
+              <w:rPr>
+                <w:rFonts w:ascii="Sylfaen" w:hAnsi="Sylfaen"/>
+                <w:lang w:val="hy-AM"/>
+              </w:rPr>
+            </w:pPr>
+          </w:p>
+        </w:tc>
+        <w:tc>
+          <w:tcPr>
+            <w:tcW w:w="843" w:type="pct"/>
+          </w:tcPr>
+          <w:p>
+            <w:pPr>
+              <w:jc w:val="center"/>
+              <w:rPr>
+                <w:rFonts w:ascii="Sylfaen" w:hAnsi="Sylfaen"/>
+                <w:sz w:val="20"/>
+                <w:lang w:val="hy-AM"/>
+              </w:rPr>
+            </w:pPr>
+          </w:p>
+        </w:tc>
+        <w:tc>
+          <w:tcPr>
+            <w:tcW w:w="860" w:type="pct"/>
+          </w:tcPr>
+          <w:p>
+            <w:pPr>
+              <w:jc w:val="center"/>
+              <w:rPr>
+                <w:rFonts w:ascii="Sylfaen" w:hAnsi="Sylfaen"/>
+                <w:lang w:val="hy-AM"/>
+              </w:rPr>
+            </w:pPr>
+          </w:p>
+        </w:tc>
+      </w:tr>
+      <w:tr>
+        <w:trPr>
+          <w:trHeight w:val="410"/>
+        </w:trPr>
+        <w:tc>
+          <w:tcPr>
+            <w:tcW w:w="326" w:type="pct"/>
+          </w:tcPr>
+          <w:p>
+            <w:pPr>
+              <w:jc w:val="center"/>
+              <w:rPr>
+                <w:rFonts w:ascii="Sylfaen" w:hAnsi="Sylfaen"/>
+                <w:lang w:val="hy-AM"/>
+              </w:rPr>
+            </w:pPr>
+          </w:p>
+        </w:tc>
+        <w:tc>
+          <w:tcPr>
+            <w:tcW w:w="2204" w:type="pct"/>
+          </w:tcPr>
+          <w:p>
+            <w:pPr>
+              <w:ind w:firstLine="0"/>
+              <w:rPr>
+                <w:rFonts w:ascii="Sylfaen" w:hAnsi="Sylfaen"/>
+                <w:sz w:val="20"/>
+                <w:lang w:val="hy-AM"/>
+              </w:rPr>
+            </w:pPr>
+            <w:r>
+              <w:rPr>
+                <w:rFonts w:ascii="Sylfaen" w:hAnsi="Sylfaen"/>
+                <w:sz w:val="20"/>
+                <w:lang w:val="hy-AM"/>
+              </w:rPr>
+              <w:t>Ռ</w:t>
+            </w:r>
+            <w:r>
+              <w:rPr>
+                <w:rFonts w:ascii="Sylfaen" w:hAnsi="Sylfaen"/>
+                <w:sz w:val="20"/>
+                <w:lang w:val="hy-AM"/>
+              </w:rPr>
+              <w:t>եգրե</w:t>
+            </w:r>
+            <w:r>
+              <w:rPr>
+                <w:rFonts w:ascii="Sylfaen" w:hAnsi="Sylfaen"/>
+                <w:sz w:val="20"/>
+                <w:lang w:val="hy-AM"/>
+              </w:rPr>
+              <w:t>սիոն մոդելների ուսումնսասիրում, փորձարկում և ընտրություն</w:t>
+            </w:r>
+          </w:p>
+        </w:tc>
+        <w:tc>
+          <w:tcPr>
+            <w:tcW w:w="767" w:type="pct"/>
+          </w:tcPr>
+          <w:p>
+            <w:pPr>
+              <w:jc w:val="center"/>
+              <w:rPr>
+                <w:rFonts w:ascii="Sylfaen" w:hAnsi="Sylfaen"/>
+                <w:lang w:val="hy-AM"/>
+              </w:rPr>
+            </w:pPr>
+          </w:p>
+        </w:tc>
+        <w:tc>
+          <w:tcPr>
+            <w:tcW w:w="843" w:type="pct"/>
+          </w:tcPr>
+          <w:p>
+            <w:pPr>
+              <w:jc w:val="center"/>
+              <w:rPr>
+                <w:rFonts w:ascii="Sylfaen" w:hAnsi="Sylfaen"/>
+                <w:sz w:val="20"/>
+                <w:lang w:val="hy-AM"/>
+              </w:rPr>
+            </w:pPr>
+          </w:p>
+        </w:tc>
+        <w:tc>
+          <w:tcPr>
+            <w:tcW w:w="860" w:type="pct"/>
+          </w:tcPr>
+          <w:p>
+            <w:pPr>
+              <w:jc w:val="center"/>
+              <w:rPr>
+                <w:rFonts w:ascii="Sylfaen" w:hAnsi="Sylfaen"/>
+                <w:lang w:val="hy-AM"/>
+              </w:rPr>
+            </w:pPr>
+          </w:p>
+        </w:tc>
+      </w:tr>
+      <w:tr>
+        <w:trPr>
+          <w:trHeight w:val="410"/>
+        </w:trPr>
+        <w:tc>
+          <w:tcPr>
+            <w:tcW w:w="326" w:type="pct"/>
+          </w:tcPr>
+          <w:p>
+            <w:pPr>
+              <w:jc w:val="center"/>
+              <w:rPr>
+                <w:rFonts w:ascii="Sylfaen" w:hAnsi="Sylfaen"/>
+                <w:lang w:val="hy-AM"/>
+              </w:rPr>
+            </w:pPr>
+          </w:p>
+        </w:tc>
+        <w:tc>
+          <w:tcPr>
+            <w:tcW w:w="2204" w:type="pct"/>
+          </w:tcPr>
+          <w:p>
+            <w:pPr>
+              <w:ind w:firstLine="0"/>
+              <w:jc w:val="center"/>
+              <w:rPr>
+                <w:rFonts w:ascii="Sylfaen" w:hAnsi="Sylfaen"/>
                 <w:sz w:val="16"/>
                 <w:szCs w:val="16"/>
                 <w:lang w:val="hy-AM"/>
@@ -4408,7 +4210,14 @@
                 <w:rFonts w:ascii="Sylfaen" w:hAnsi="Sylfaen"/>
                 <w:lang w:val="hy-AM"/>
               </w:rPr>
-              <w:t xml:space="preserve">I I I </w:t>
+              <w:t>II</w:t>
+            </w:r>
+            <w:r>
+              <w:rPr>
+                <w:rFonts w:ascii="Sylfaen" w:hAnsi="Sylfaen"/>
+                <w:lang w:val="hy-AM"/>
+              </w:rPr>
+              <w:t xml:space="preserve">I </w:t>
             </w:r>
             <w:r>
               <w:rPr>
@@ -4453,6 +4262,7 @@
               <w:jc w:val="center"/>
               <w:rPr>
                 <w:rFonts w:ascii="Sylfaen" w:hAnsi="Sylfaen"/>
+                <w:sz w:val="20"/>
                 <w:lang w:val="hy-AM"/>
               </w:rPr>
             </w:pPr>
@@ -4484,7 +4294,7 @@
       </w:tr>
       <w:tr>
         <w:trPr>
-          <w:trHeight w:val="480"/>
+          <w:trHeight w:val="410"/>
         </w:trPr>
         <w:tc>
           <w:tcPr>
@@ -4518,10 +4328,19 @@
             <w:r>
               <w:rPr>
                 <w:rFonts w:ascii="Sylfaen" w:hAnsi="Sylfaen"/>
+                <w:sz w:val="18"/>
                 <w:szCs w:val="28"/>
                 <w:lang w:val="hy-AM"/>
               </w:rPr>
-              <w:t>Աշխատանքի վերջնական ամփոփում և ձևակերպում։</w:t>
+              <w:t>Աշխատանքի վերջնական ամփոփում և ձևակերպում</w:t>
+            </w:r>
+            <w:r>
+              <w:rPr>
+                <w:rFonts w:ascii="Sylfaen" w:hAnsi="Sylfaen"/>
+                <w:szCs w:val="28"/>
+                <w:lang w:val="hy-AM"/>
+              </w:rPr>
+              <w:t>։</w:t>
             </w:r>
           </w:p>
         </w:tc>
@@ -4548,6 +4367,7 @@
               <w:jc w:val="center"/>
               <w:rPr>
                 <w:rFonts w:ascii="Sylfaen" w:hAnsi="Sylfaen"/>
+                <w:sz w:val="20"/>
                 <w:lang w:val="hy-AM"/>
               </w:rPr>
             </w:pPr>
@@ -4570,7 +4390,7 @@
       </w:tr>
       <w:tr>
         <w:trPr>
-          <w:trHeight w:val="480"/>
+          <w:trHeight w:val="410"/>
         </w:trPr>
         <w:tc>
           <w:tcPr>
@@ -4648,6 +4468,7 @@
               <w:jc w:val="center"/>
               <w:rPr>
                 <w:rFonts w:ascii="Sylfaen" w:hAnsi="Sylfaen"/>
+                <w:sz w:val="20"/>
                 <w:lang w:val="hy-AM"/>
               </w:rPr>
             </w:pPr>
@@ -4680,6 +4501,75 @@
     </w:tbl>
     <w:p>
       <w:pPr>
+        <w:ind w:firstLine="0"/>
+        <w:rPr>
+          <w:rFonts w:ascii="Sylfaen" w:hAnsi="Sylfaen"/>
+          <w:lang w:val="hy-AM"/>
+        </w:rPr>
+      </w:pPr>
+    </w:p>
+    <w:p>
+      <w:pPr>
+        <w:spacing w:line="240" w:lineRule="auto"/>
+        <w:ind w:firstLine="0"/>
+        <w:rPr>
+          <w:rFonts w:ascii="Sylfaen" w:hAnsi="Sylfaen"/>
+          <w:lang w:val="hy-AM"/>
+        </w:rPr>
+      </w:pPr>
+      <w:r>
+        <w:rPr>
+          <w:rFonts w:ascii="Sylfaen" w:hAnsi="Sylfaen"/>
+          <w:lang w:val="hy-AM"/>
+        </w:rPr>
+        <w:t xml:space="preserve">6. </w:t>
+      </w:r>
+      <w:r>
+        <w:rPr>
+          <w:rFonts w:ascii="Sylfaen" w:hAnsi="Sylfaen" w:cs="Sylfaen"/>
+          <w:lang w:val="hy-AM"/>
+        </w:rPr>
+        <w:t>Աշխատանքի</w:t>
+      </w:r>
+      <w:r>
+        <w:rPr>
+          <w:rFonts w:ascii="Sylfaen" w:hAnsi="Sylfaen" w:cs="Arial Armenian"/>
+          <w:lang w:val="hy-AM"/>
+        </w:rPr>
+        <w:t xml:space="preserve"> </w:t>
+      </w:r>
+      <w:r>
+        <w:rPr>
+          <w:rFonts w:ascii="Sylfaen" w:hAnsi="Sylfaen" w:cs="Sylfaen"/>
+          <w:lang w:val="hy-AM"/>
+        </w:rPr>
+        <w:t>պաշտպանության</w:t>
+      </w:r>
+      <w:r>
+        <w:rPr>
+          <w:rFonts w:ascii="Sylfaen" w:hAnsi="Sylfaen" w:cs="Arial Armenian"/>
+          <w:lang w:val="hy-AM"/>
+        </w:rPr>
+        <w:t xml:space="preserve"> </w:t>
+      </w:r>
+      <w:r>
+        <w:rPr>
+          <w:rFonts w:ascii="Sylfaen" w:hAnsi="Sylfaen" w:cs="Sylfaen"/>
+          <w:lang w:val="hy-AM"/>
+        </w:rPr>
+        <w:t>օրը</w:t>
+      </w:r>
+      <w:r>
+        <w:rPr>
+          <w:rFonts w:ascii="Sylfaen" w:hAnsi="Sylfaen" w:cs="Arial Armenian"/>
+          <w:lang w:val="hy-AM"/>
+        </w:rPr>
+        <w:t xml:space="preserve"> ___________________________________________</w:t>
+      </w:r>
+    </w:p>
+    <w:p>
+      <w:pPr>
+        <w:spacing w:line="240" w:lineRule="auto"/>
         <w:rPr>
           <w:rFonts w:ascii="Sylfaen" w:hAnsi="Sylfaen"/>
           <w:sz w:val="16"/>
@@ -4690,74 +4580,222 @@
     </w:p>
     <w:p>
       <w:pPr>
-        <w:rPr>
-          <w:rFonts w:ascii="Sylfaen" w:hAnsi="Sylfaen"/>
-          <w:lang w:val="hy-AM"/>
-        </w:rPr>
-      </w:pPr>
+        <w:spacing w:line="240" w:lineRule="auto"/>
+        <w:ind w:firstLine="0"/>
+        <w:rPr>
+          <w:rFonts w:ascii="Sylfaen" w:hAnsi="Sylfaen"/>
+          <w:u w:val="single"/>
+          <w:lang w:val="hy-AM"/>
+        </w:rPr>
+      </w:pPr>
+      <w:r>
+        <w:rPr>
+          <w:rFonts w:ascii="Sylfaen" w:hAnsi="Sylfaen"/>
+          <w:lang w:val="hy-AM"/>
+        </w:rPr>
+        <w:t xml:space="preserve">7. </w:t>
+      </w:r>
+      <w:r>
+        <w:rPr>
+          <w:rFonts w:ascii="Sylfaen" w:hAnsi="Sylfaen" w:cs="Sylfaen"/>
+          <w:lang w:val="hy-AM"/>
+        </w:rPr>
+        <w:t>Ամբիոնի</w:t>
+      </w:r>
+      <w:r>
+        <w:rPr>
+          <w:rFonts w:ascii="Sylfaen" w:hAnsi="Sylfaen" w:cs="Arial Armenian"/>
+          <w:lang w:val="hy-AM"/>
+        </w:rPr>
+        <w:t xml:space="preserve"> </w:t>
+      </w:r>
+      <w:r>
+        <w:rPr>
+          <w:rFonts w:ascii="Sylfaen" w:hAnsi="Sylfaen" w:cs="Sylfaen"/>
+          <w:lang w:val="hy-AM"/>
+        </w:rPr>
+        <w:t>վարիչ</w:t>
+      </w:r>
+      <w:r>
+        <w:rPr>
+          <w:rFonts w:ascii="Sylfaen" w:hAnsi="Sylfaen" w:cs="Arial Armenian"/>
+          <w:lang w:val="hy-AM"/>
+        </w:rPr>
+        <w:t xml:space="preserve"> </w:t>
+      </w:r>
+      <w:r>
+        <w:rPr>
+          <w:rFonts w:ascii="Sylfaen" w:hAnsi="Sylfaen" w:cs="Arial Armenian"/>
+          <w:u w:val="single"/>
+          <w:lang w:val="hy-AM"/>
+        </w:rPr>
+        <w:t xml:space="preserve">     Տ. Մ. Խուդոյան</w:t>
+      </w:r>
+      <w:r>
+        <w:rPr>
+          <w:rFonts w:ascii="Sylfaen" w:hAnsi="Sylfaen" w:cs="Arial Armenian"/>
+          <w:u w:val="single"/>
+          <w:lang w:val="hy-AM"/>
+        </w:rPr>
+        <w:tab/>
+      </w:r>
+      <w:r>
+        <w:rPr>
+          <w:rFonts w:ascii="Sylfaen" w:hAnsi="Sylfaen" w:cs="Arial Armenian"/>
+          <w:u w:val="single"/>
+          <w:lang w:val="hy-AM"/>
+        </w:rPr>
+        <w:tab/>
+      </w:r>
+      <w:r>
+        <w:rPr>
+          <w:rFonts w:ascii="Sylfaen" w:hAnsi="Sylfaen" w:cs="Arial Armenian"/>
+          <w:u w:val="single"/>
+          <w:lang w:val="hy-AM"/>
+        </w:rPr>
+        <w:tab/>
+      </w:r>
+      <w:r>
+        <w:rPr>
+          <w:rFonts w:ascii="Sylfaen" w:hAnsi="Sylfaen" w:cs="Arial Armenian"/>
+          <w:u w:val="single"/>
+          <w:lang w:val="hy-AM"/>
+        </w:rPr>
+        <w:tab/>
+      </w:r>
+      <w:r>
+        <w:rPr>
+          <w:rFonts w:ascii="Sylfaen" w:hAnsi="Sylfaen" w:cs="Arial Armenian"/>
+          <w:u w:val="single"/>
+          <w:lang w:val="hy-AM"/>
+        </w:rPr>
+        <w:tab/>
+      </w:r>
+      <w:r>
+        <w:rPr>
+          <w:rFonts w:ascii="Sylfaen" w:hAnsi="Sylfaen" w:cs="Arial Armenian"/>
+          <w:u w:val="single"/>
+          <w:lang w:val="hy-AM"/>
+        </w:rPr>
+        <w:tab/>
+        <w:t xml:space="preserve">_                            </w:t>
+      </w:r>
     </w:p>
     <w:p>
       <w:pPr>
         <w:spacing w:line="240" w:lineRule="auto"/>
-        <w:ind w:firstLine="0"/>
-        <w:rPr>
-          <w:rFonts w:ascii="Sylfaen" w:hAnsi="Sylfaen"/>
-          <w:lang w:val="hy-AM"/>
-        </w:rPr>
-      </w:pPr>
-      <w:r>
-        <w:rPr>
-          <w:rFonts w:ascii="Sylfaen" w:hAnsi="Sylfaen"/>
-          <w:lang w:val="hy-AM"/>
-        </w:rPr>
-        <w:t xml:space="preserve">6. </w:t>
-      </w:r>
-      <w:r>
-        <w:rPr>
-          <w:rFonts w:ascii="Sylfaen" w:hAnsi="Sylfaen" w:cs="Sylfaen"/>
-          <w:lang w:val="hy-AM"/>
-        </w:rPr>
-        <w:t>Աշխատանքի</w:t>
-      </w:r>
-      <w:r>
-        <w:rPr>
-          <w:rFonts w:ascii="Sylfaen" w:hAnsi="Sylfaen" w:cs="Arial Armenian"/>
-          <w:lang w:val="hy-AM"/>
-        </w:rPr>
-        <w:t xml:space="preserve"> </w:t>
-      </w:r>
-      <w:r>
-        <w:rPr>
-          <w:rFonts w:ascii="Sylfaen" w:hAnsi="Sylfaen" w:cs="Sylfaen"/>
-          <w:lang w:val="hy-AM"/>
-        </w:rPr>
-        <w:t>պաշտպանության</w:t>
-      </w:r>
-      <w:r>
-        <w:rPr>
-          <w:rFonts w:ascii="Sylfaen" w:hAnsi="Sylfaen" w:cs="Arial Armenian"/>
-          <w:lang w:val="hy-AM"/>
-        </w:rPr>
-        <w:t xml:space="preserve"> </w:t>
-      </w:r>
-      <w:r>
-        <w:rPr>
-          <w:rFonts w:ascii="Sylfaen" w:hAnsi="Sylfaen" w:cs="Sylfaen"/>
-          <w:lang w:val="hy-AM"/>
-        </w:rPr>
-        <w:t>օրը</w:t>
-      </w:r>
-      <w:r>
-        <w:rPr>
-          <w:rFonts w:ascii="Sylfaen" w:hAnsi="Sylfaen" w:cs="Arial Armenian"/>
-          <w:lang w:val="hy-AM"/>
-        </w:rPr>
-        <w:t xml:space="preserve"> ___________________________________________</w:t>
+        <w:jc w:val="center"/>
+        <w:rPr>
+          <w:rFonts w:ascii="Sylfaen" w:hAnsi="Sylfaen"/>
+          <w:sz w:val="18"/>
+          <w:szCs w:val="18"/>
+          <w:lang w:val="hy-AM"/>
+        </w:rPr>
+      </w:pPr>
+      <w:r>
+        <w:rPr>
+          <w:rFonts w:ascii="Sylfaen" w:hAnsi="Sylfaen"/>
+          <w:sz w:val="18"/>
+          <w:szCs w:val="18"/>
+          <w:lang w:val="hy-AM"/>
+        </w:rPr>
+        <w:t xml:space="preserve">             (</w:t>
+      </w:r>
+      <w:r>
+        <w:rPr>
+          <w:rFonts w:ascii="Sylfaen" w:hAnsi="Sylfaen" w:cs="Sylfaen"/>
+          <w:sz w:val="18"/>
+          <w:szCs w:val="18"/>
+          <w:lang w:val="hy-AM"/>
+        </w:rPr>
+        <w:t>Ա</w:t>
+      </w:r>
+      <w:r>
+        <w:rPr>
+          <w:rFonts w:ascii="Sylfaen" w:hAnsi="Sylfaen" w:cs="Arial Armenian"/>
+          <w:sz w:val="18"/>
+          <w:szCs w:val="18"/>
+          <w:lang w:val="hy-AM"/>
+        </w:rPr>
+        <w:t>.</w:t>
+      </w:r>
+      <w:r>
+        <w:rPr>
+          <w:rFonts w:ascii="Sylfaen" w:hAnsi="Sylfaen" w:cs="Sylfaen"/>
+          <w:sz w:val="18"/>
+          <w:szCs w:val="18"/>
+          <w:lang w:val="hy-AM"/>
+        </w:rPr>
+        <w:t>Ա</w:t>
+      </w:r>
+      <w:r>
+        <w:rPr>
+          <w:rFonts w:ascii="Sylfaen" w:hAnsi="Sylfaen" w:cs="Arial Armenian"/>
+          <w:sz w:val="18"/>
+          <w:szCs w:val="18"/>
+          <w:lang w:val="hy-AM"/>
+        </w:rPr>
+        <w:t>.</w:t>
+      </w:r>
+      <w:r>
+        <w:rPr>
+          <w:rFonts w:ascii="Sylfaen" w:hAnsi="Sylfaen" w:cs="Sylfaen"/>
+          <w:sz w:val="18"/>
+          <w:szCs w:val="18"/>
+          <w:lang w:val="hy-AM"/>
+        </w:rPr>
+        <w:t>Հ</w:t>
+      </w:r>
+      <w:r>
+        <w:rPr>
+          <w:rFonts w:ascii="Sylfaen" w:hAnsi="Sylfaen" w:cs="Arial Armenian"/>
+          <w:sz w:val="18"/>
+          <w:szCs w:val="18"/>
+          <w:lang w:val="hy-AM"/>
+        </w:rPr>
+        <w:t xml:space="preserve">., </w:t>
+      </w:r>
+      <w:r>
+        <w:rPr>
+          <w:rFonts w:ascii="Sylfaen" w:hAnsi="Sylfaen" w:cs="Sylfaen"/>
+          <w:sz w:val="18"/>
+          <w:szCs w:val="18"/>
+          <w:lang w:val="hy-AM"/>
+        </w:rPr>
+        <w:t>ստորագրություն</w:t>
+      </w:r>
+      <w:r>
+        <w:rPr>
+          <w:rFonts w:ascii="Sylfaen" w:hAnsi="Sylfaen" w:cs="Arial Armenian"/>
+          <w:sz w:val="18"/>
+          <w:szCs w:val="18"/>
+          <w:lang w:val="hy-AM"/>
+        </w:rPr>
+        <w:t xml:space="preserve">, </w:t>
+      </w:r>
+      <w:r>
+        <w:rPr>
+          <w:rFonts w:ascii="Sylfaen" w:hAnsi="Sylfaen" w:cs="Sylfaen"/>
+          <w:sz w:val="18"/>
+          <w:szCs w:val="18"/>
+          <w:lang w:val="hy-AM"/>
+        </w:rPr>
+        <w:t>ամսաթիվ</w:t>
+      </w:r>
+      <w:r>
+        <w:rPr>
+          <w:rFonts w:ascii="Sylfaen" w:hAnsi="Sylfaen"/>
+          <w:sz w:val="18"/>
+          <w:szCs w:val="18"/>
+          <w:lang w:val="hy-AM"/>
+        </w:rPr>
+        <w:t>)</w:t>
       </w:r>
     </w:p>
     <w:p>
       <w:pPr>
         <w:spacing w:line="240" w:lineRule="auto"/>
+        <w:jc w:val="center"/>
         <w:rPr>
           <w:rFonts w:ascii="Sylfaen" w:hAnsi="Sylfaen"/>
           <w:sz w:val="16"/>
@@ -4772,23 +4810,22 @@
         <w:ind w:firstLine="0"/>
         <w:rPr>
           <w:rFonts w:ascii="Sylfaen" w:hAnsi="Sylfaen"/>
-          <w:u w:val="single"/>
-          <w:lang w:val="hy-AM"/>
-        </w:rPr>
-      </w:pPr>
-      <w:r>
-        <w:rPr>
-          <w:rFonts w:ascii="Sylfaen" w:hAnsi="Sylfaen"/>
-          <w:lang w:val="hy-AM"/>
-        </w:rPr>
-        <w:t xml:space="preserve">7. </w:t>
-      </w:r>
-      <w:r>
-        <w:rPr>
-          <w:rFonts w:ascii="Sylfaen" w:hAnsi="Sylfaen" w:cs="Sylfaen"/>
-          <w:lang w:val="hy-AM"/>
-        </w:rPr>
-        <w:t>Ամբիոնի</w:t>
+          <w:lang w:val="hy-AM"/>
+        </w:rPr>
+      </w:pPr>
+      <w:r>
+        <w:rPr>
+          <w:rFonts w:ascii="Sylfaen" w:hAnsi="Sylfaen"/>
+          <w:lang w:val="hy-AM"/>
+        </w:rPr>
+        <w:t xml:space="preserve">8. </w:t>
+      </w:r>
+      <w:r>
+        <w:rPr>
+          <w:rFonts w:ascii="Sylfaen" w:hAnsi="Sylfaen" w:cs="Sylfaen"/>
+          <w:lang w:val="hy-AM"/>
+        </w:rPr>
+        <w:t>Աշխատանքի</w:t>
       </w:r>
       <w:r>
         <w:rPr>
@@ -4802,22 +4839,51 @@
           <w:rFonts w:ascii="Sylfaen" w:hAnsi="Sylfaen" w:cs="Sylfaen"/>
           <w:lang w:val="hy-AM"/>
         </w:rPr>
-        <w:t>վարիչ</w:t>
-      </w:r>
-      <w:r>
-        <w:rPr>
-          <w:rFonts w:ascii="Sylfaen" w:hAnsi="Sylfaen" w:cs="Arial Armenian"/>
+        <w:t>ղեկավար</w:t>
+      </w:r>
+      <w:r>
+        <w:rPr>
+          <w:rFonts w:ascii="Sylfaen" w:hAnsi="Sylfaen" w:cs="Arial Armenian"/>
+          <w:lang w:val="hy-AM"/>
+        </w:rPr>
+        <w:t xml:space="preserve"> _</w:t>
+      </w:r>
+      <w:r>
+        <w:rPr>
+          <w:rFonts w:ascii="Times New Roman" w:hAnsi="Times New Roman"/>
+          <w:i/>
+          <w:iCs/>
+          <w:color w:val="000000" w:themeColor="text1"/>
+          <w:u w:val="single"/>
           <w:lang w:val="hy-AM"/>
         </w:rPr>
         <w:t xml:space="preserve"> </w:t>
       </w:r>
       <w:r>
         <w:rPr>
-          <w:rFonts w:ascii="Sylfaen" w:hAnsi="Sylfaen" w:cs="Arial Armenian"/>
-          <w:u w:val="single"/>
-          <w:lang w:val="hy-AM"/>
-        </w:rPr>
-        <w:t xml:space="preserve">     Տ. Մ. Խուդոյան</w:t>
+          <w:rFonts w:ascii="Times New Roman" w:hAnsi="Times New Roman"/>
+          <w:iCs/>
+          <w:color w:val="000000" w:themeColor="text1"/>
+          <w:u w:val="single"/>
+          <w:lang w:val="hy-AM"/>
+        </w:rPr>
+        <w:t>Սուրեն Էդիլյան Կարենի</w:t>
+      </w:r>
+      <w:r>
+        <w:rPr>
+          <w:rFonts w:ascii="Sylfaen" w:hAnsi="Sylfaen"/>
+          <w:color w:val="000000" w:themeColor="text1"/>
+          <w:u w:val="single"/>
+          <w:lang w:val="hy-AM"/>
+        </w:rPr>
+        <w:t xml:space="preserve"> </w:t>
+      </w:r>
+      <w:r>
+        <w:rPr>
+          <w:rFonts w:ascii="Sylfaen" w:hAnsi="Sylfaen" w:cs="Arial Armenian"/>
+          <w:lang w:val="hy-AM"/>
+        </w:rPr>
+        <w:t>_____________________________________</w:t>
       </w:r>
       <w:r>
         <w:rPr>
@@ -4833,61 +4899,27 @@
           <w:u w:val="single"/>
           <w:lang w:val="hy-AM"/>
         </w:rPr>
-        <w:tab/>
-      </w:r>
-      <w:r>
-        <w:rPr>
-          <w:rFonts w:ascii="Sylfaen" w:hAnsi="Sylfaen" w:cs="Arial Armenian"/>
-          <w:u w:val="single"/>
-          <w:lang w:val="hy-AM"/>
-        </w:rPr>
-        <w:tab/>
-      </w:r>
-      <w:r>
-        <w:rPr>
-          <w:rFonts w:ascii="Sylfaen" w:hAnsi="Sylfaen" w:cs="Arial Armenian"/>
-          <w:u w:val="single"/>
-          <w:lang w:val="hy-AM"/>
-        </w:rPr>
-        <w:tab/>
-      </w:r>
-      <w:r>
-        <w:rPr>
-          <w:rFonts w:ascii="Sylfaen" w:hAnsi="Sylfaen" w:cs="Arial Armenian"/>
-          <w:u w:val="single"/>
-          <w:lang w:val="hy-AM"/>
-        </w:rPr>
-        <w:tab/>
-      </w:r>
-      <w:r>
-        <w:rPr>
-          <w:rFonts w:ascii="Sylfaen" w:hAnsi="Sylfaen" w:cs="Arial Armenian"/>
-          <w:u w:val="single"/>
-          <w:lang w:val="hy-AM"/>
-        </w:rPr>
-        <w:tab/>
-        <w:t xml:space="preserve">_                            </w:t>
+        <w:t xml:space="preserve">   </w:t>
       </w:r>
     </w:p>
     <w:p>
       <w:pPr>
         <w:spacing w:line="240" w:lineRule="auto"/>
-        <w:jc w:val="center"/>
-        <w:rPr>
-          <w:rFonts w:ascii="Sylfaen" w:hAnsi="Sylfaen"/>
-          <w:sz w:val="18"/>
-          <w:szCs w:val="18"/>
-          <w:lang w:val="hy-AM"/>
-        </w:rPr>
-      </w:pPr>
-      <w:r>
-        <w:rPr>
-          <w:rFonts w:ascii="Sylfaen" w:hAnsi="Sylfaen"/>
-          <w:sz w:val="18"/>
-          <w:szCs w:val="18"/>
-          <w:lang w:val="hy-AM"/>
-        </w:rPr>
-        <w:t xml:space="preserve">             (</w:t>
+        <w:rPr>
+          <w:rFonts w:ascii="Sylfaen" w:hAnsi="Sylfaen"/>
+          <w:sz w:val="18"/>
+          <w:szCs w:val="18"/>
+          <w:lang w:val="hy-AM"/>
+        </w:rPr>
+      </w:pPr>
+      <w:r>
+        <w:rPr>
+          <w:rFonts w:ascii="Sylfaen" w:hAnsi="Sylfaen"/>
+          <w:sz w:val="18"/>
+          <w:szCs w:val="18"/>
+          <w:lang w:val="hy-AM"/>
+        </w:rPr>
+        <w:t xml:space="preserve">                                                                           (</w:t>
       </w:r>
       <w:r>
         <w:rPr>
@@ -4983,11 +5015,63 @@
     <w:p>
       <w:pPr>
         <w:spacing w:line="240" w:lineRule="auto"/>
-        <w:jc w:val="center"/>
+        <w:ind w:firstLine="0"/>
+        <w:rPr>
+          <w:rFonts w:ascii="Sylfaen" w:hAnsi="Sylfaen"/>
+          <w:lang w:val="hy-AM"/>
+        </w:rPr>
+      </w:pPr>
+      <w:r>
+        <w:rPr>
+          <w:rFonts w:ascii="Sylfaen" w:hAnsi="Sylfaen"/>
+          <w:lang w:val="hy-AM"/>
+        </w:rPr>
+        <w:t xml:space="preserve">9. </w:t>
+      </w:r>
+      <w:r>
+        <w:rPr>
+          <w:rFonts w:ascii="Sylfaen" w:hAnsi="Sylfaen" w:cs="Sylfaen"/>
+          <w:lang w:val="hy-AM"/>
+        </w:rPr>
+        <w:t>Աշխատանքի</w:t>
+      </w:r>
+      <w:r>
+        <w:rPr>
+          <w:rFonts w:ascii="Sylfaen" w:hAnsi="Sylfaen" w:cs="Arial Armenian"/>
+          <w:lang w:val="hy-AM"/>
+        </w:rPr>
+        <w:t xml:space="preserve"> </w:t>
+      </w:r>
+      <w:r>
+        <w:rPr>
+          <w:rFonts w:ascii="Sylfaen" w:hAnsi="Sylfaen" w:cs="Sylfaen"/>
+          <w:lang w:val="hy-AM"/>
+        </w:rPr>
+        <w:t>բաժինների</w:t>
+      </w:r>
+      <w:r>
+        <w:rPr>
+          <w:rFonts w:ascii="Sylfaen" w:hAnsi="Sylfaen" w:cs="Arial Armenian"/>
+          <w:lang w:val="hy-AM"/>
+        </w:rPr>
+        <w:t xml:space="preserve"> </w:t>
+      </w:r>
+      <w:r>
+        <w:rPr>
+          <w:rFonts w:ascii="Sylfaen" w:hAnsi="Sylfaen" w:cs="Sylfaen"/>
+          <w:lang w:val="hy-AM"/>
+        </w:rPr>
+        <w:t>խորհրդատուներ</w:t>
+      </w:r>
+    </w:p>
+    <w:p>
+      <w:pPr>
+        <w:spacing w:line="240" w:lineRule="auto"/>
         <w:rPr>
           <w:rFonts w:ascii="Sylfaen" w:hAnsi="Sylfaen"/>
           <w:sz w:val="16"/>
           <w:szCs w:val="16"/>
+          <w:u w:val="single"/>
           <w:lang w:val="hy-AM"/>
         </w:rPr>
       </w:pPr>
@@ -5006,52 +5090,85 @@
           <w:rFonts w:ascii="Sylfaen" w:hAnsi="Sylfaen"/>
           <w:lang w:val="hy-AM"/>
         </w:rPr>
-        <w:t xml:space="preserve">8. </w:t>
-      </w:r>
-      <w:r>
-        <w:rPr>
-          <w:rFonts w:ascii="Sylfaen" w:hAnsi="Sylfaen" w:cs="Sylfaen"/>
-          <w:lang w:val="hy-AM"/>
-        </w:rPr>
-        <w:t>Աշխատանքի</w:t>
-      </w:r>
-      <w:r>
-        <w:rPr>
-          <w:rFonts w:ascii="Sylfaen" w:hAnsi="Sylfaen" w:cs="Arial Armenian"/>
+        <w:t xml:space="preserve">9.1. </w:t>
+      </w:r>
+      <w:r>
+        <w:rPr>
+          <w:rFonts w:ascii="Sylfaen" w:hAnsi="Sylfaen" w:cs="Sylfaen"/>
+          <w:lang w:val="hy-AM"/>
+        </w:rPr>
+        <w:t>Էկոնոմիկական</w:t>
+      </w:r>
+      <w:r>
+        <w:rPr>
+          <w:rFonts w:ascii="Sylfaen" w:hAnsi="Sylfaen" w:cs="Arial Armenian"/>
+          <w:u w:val="single"/>
           <w:lang w:val="hy-AM"/>
         </w:rPr>
         <w:t xml:space="preserve"> </w:t>
       </w:r>
       <w:r>
         <w:rPr>
-          <w:rFonts w:ascii="Sylfaen" w:hAnsi="Sylfaen" w:cs="Sylfaen"/>
-          <w:lang w:val="hy-AM"/>
-        </w:rPr>
-        <w:t>ղեկավար</w:t>
-      </w:r>
-      <w:r>
-        <w:rPr>
-          <w:rFonts w:ascii="Sylfaen" w:hAnsi="Sylfaen" w:cs="Arial Armenian"/>
-          <w:lang w:val="hy-AM"/>
-        </w:rPr>
-        <w:t xml:space="preserve"> ______________________________________</w:t>
-      </w:r>
-      <w:r>
-        <w:rPr>
-          <w:rFonts w:ascii="Sylfaen" w:hAnsi="Sylfaen" w:cs="Arial Armenian"/>
-          <w:u w:val="single"/>
-          <w:lang w:val="hy-AM"/>
-        </w:rPr>
-        <w:tab/>
-      </w:r>
-      <w:r>
-        <w:rPr>
-          <w:rFonts w:ascii="Sylfaen" w:hAnsi="Sylfaen" w:cs="Arial Armenian"/>
-          <w:u w:val="single"/>
-          <w:lang w:val="hy-AM"/>
-        </w:rPr>
-        <w:tab/>
-        <w:t xml:space="preserve">   </w:t>
+          <w:rFonts w:ascii="Times New Roman" w:hAnsi="Times New Roman"/>
+          <w:u w:val="single"/>
+          <w:lang w:val="hy-AM"/>
+        </w:rPr>
+        <w:t xml:space="preserve">Նարինե Ադոնց </w:t>
+      </w:r>
+      <w:r>
+        <w:rPr>
+          <w:rFonts w:ascii="Sylfaen" w:hAnsi="Sylfaen"/>
+          <w:u w:val="single"/>
+          <w:lang w:val="af-ZA"/>
+        </w:rPr>
+        <w:t>Պավլիկի</w:t>
+      </w:r>
+      <w:r>
+        <w:rPr>
+          <w:rFonts w:ascii="Times New Roman" w:hAnsi="Times New Roman"/>
+          <w:color w:val="000000"/>
+          <w:u w:val="single"/>
+          <w:lang w:val="hy-AM"/>
+        </w:rPr>
+        <w:t xml:space="preserve">  </w:t>
+      </w:r>
+      <w:r>
+        <w:rPr>
+          <w:rFonts w:ascii="Sylfaen" w:hAnsi="Sylfaen" w:cs="Arial Armenian"/>
+          <w:u w:val="single"/>
+          <w:lang w:val="hy-AM"/>
+        </w:rPr>
+        <w:t xml:space="preserve">  </w:t>
+      </w:r>
+      <w:r>
+        <w:rPr>
+          <w:rFonts w:ascii="Sylfaen" w:hAnsi="Sylfaen" w:cs="Arial Armenian"/>
+          <w:u w:val="single"/>
+        </w:rPr>
+        <w:t xml:space="preserve">     </w:t>
+      </w:r>
+      <w:r>
+        <w:rPr>
+          <w:rFonts w:ascii="Sylfaen" w:hAnsi="Sylfaen" w:cs="Arial Armenian"/>
+          <w:u w:val="single"/>
+          <w:lang w:val="hy-AM"/>
+        </w:rPr>
+        <w:t xml:space="preserve"> </w:t>
+      </w:r>
+      <w:r>
+        <w:rPr>
+          <w:rFonts w:ascii="Sylfaen" w:hAnsi="Sylfaen" w:cs="Arial Armenian"/>
+          <w:u w:val="single"/>
+          <w:lang w:val="hy-AM"/>
+        </w:rPr>
+        <w:t>___________________________________</w:t>
+      </w:r>
+      <w:r>
+        <w:rPr>
+          <w:rFonts w:ascii="Sylfaen" w:hAnsi="Sylfaen" w:cs="Arial Armenian"/>
+          <w:lang w:val="hy-AM"/>
+        </w:rPr>
+        <w:t>_____</w:t>
       </w:r>
     </w:p>
     <w:p>
@@ -5071,7 +5188,7 @@
           <w:szCs w:val="18"/>
           <w:lang w:val="hy-AM"/>
         </w:rPr>
-        <w:t xml:space="preserve">                                                                           (</w:t>
+        <w:t xml:space="preserve">                                                                            (</w:t>
       </w:r>
       <w:r>
         <w:rPr>
@@ -5178,14 +5295,14 @@
           <w:rFonts w:ascii="Sylfaen" w:hAnsi="Sylfaen"/>
           <w:lang w:val="hy-AM"/>
         </w:rPr>
-        <w:t xml:space="preserve">9. </w:t>
-      </w:r>
-      <w:r>
-        <w:rPr>
-          <w:rFonts w:ascii="Sylfaen" w:hAnsi="Sylfaen" w:cs="Sylfaen"/>
-          <w:lang w:val="hy-AM"/>
-        </w:rPr>
-        <w:t>Աշխատանքի</w:t>
+        <w:t xml:space="preserve">9.2. </w:t>
+      </w:r>
+      <w:r>
+        <w:rPr>
+          <w:rFonts w:ascii="Sylfaen" w:hAnsi="Sylfaen" w:cs="Sylfaen"/>
+          <w:lang w:val="hy-AM"/>
+        </w:rPr>
+        <w:t>Կենսագործնեության</w:t>
       </w:r>
       <w:r>
         <w:rPr>
@@ -5199,21 +5316,60 @@
           <w:rFonts w:ascii="Sylfaen" w:hAnsi="Sylfaen" w:cs="Sylfaen"/>
           <w:lang w:val="hy-AM"/>
         </w:rPr>
-        <w:t>բաժինների</w:t>
-      </w:r>
-      <w:r>
-        <w:rPr>
-          <w:rFonts w:ascii="Sylfaen" w:hAnsi="Sylfaen" w:cs="Arial Armenian"/>
-          <w:lang w:val="hy-AM"/>
+        <w:t>անվտանգության</w:t>
+      </w:r>
+      <w:r>
+        <w:rPr>
+          <w:rFonts w:ascii="Sylfaen" w:hAnsi="Sylfaen" w:cs="Arial Armenian"/>
+          <w:u w:val="single"/>
+          <w:lang w:val="hy-AM"/>
+        </w:rPr>
+        <w:t xml:space="preserve">   </w:t>
+      </w:r>
+      <w:r>
+        <w:rPr>
+          <w:rFonts w:ascii="Times New Roman" w:eastAsia="Times New Roman" w:hAnsi="Times New Roman"/>
+          <w:u w:val="single"/>
+          <w:lang w:val="hy-AM"/>
+        </w:rPr>
+        <w:t>Սերգեյ Խաչատրյան</w:t>
+      </w:r>
+      <w:r>
+        <w:rPr>
+          <w:rFonts w:ascii="Times New Roman" w:eastAsia="Times New Roman" w:hAnsi="Times New Roman"/>
+          <w:u w:val="single"/>
+          <w:lang w:val="it-IT"/>
         </w:rPr>
         <w:t xml:space="preserve"> </w:t>
       </w:r>
       <w:r>
         <w:rPr>
-          <w:rFonts w:ascii="Sylfaen" w:hAnsi="Sylfaen" w:cs="Sylfaen"/>
-          <w:lang w:val="hy-AM"/>
-        </w:rPr>
-        <w:t>խորհրդատուներ</w:t>
+          <w:rFonts w:ascii="Sylfaen" w:hAnsi="Sylfaen"/>
+          <w:u w:val="single"/>
+          <w:lang w:val="hy-AM"/>
+        </w:rPr>
+        <w:t>Սամվելի</w:t>
+      </w:r>
+      <w:r>
+        <w:rPr>
+          <w:rFonts w:ascii="Sylfaen" w:hAnsi="Sylfaen" w:cs="Arial Armenian"/>
+          <w:lang w:val="hy-AM"/>
+        </w:rPr>
+        <w:t>____</w:t>
+      </w:r>
+      <w:r>
+        <w:rPr>
+          <w:rFonts w:ascii="Sylfaen" w:hAnsi="Sylfaen" w:cs="Arial Armenian"/>
+          <w:lang w:val="hy-AM"/>
+        </w:rPr>
+        <w:t>______</w:t>
+      </w:r>
+      <w:r>
+        <w:rPr>
+          <w:rFonts w:ascii="Sylfaen" w:hAnsi="Sylfaen" w:cs="Arial Armenian"/>
+          <w:lang w:val="hy-AM"/>
+        </w:rPr>
+        <w:t>________</w:t>
       </w:r>
     </w:p>
     <w:p>
@@ -5221,9 +5377,137 @@
         <w:spacing w:line="240" w:lineRule="auto"/>
         <w:rPr>
           <w:rFonts w:ascii="Sylfaen" w:hAnsi="Sylfaen"/>
+          <w:sz w:val="18"/>
+          <w:szCs w:val="18"/>
+          <w:lang w:val="hy-AM"/>
+        </w:rPr>
+      </w:pPr>
+      <w:r>
+        <w:rPr>
+          <w:rFonts w:ascii="Sylfaen" w:hAnsi="Sylfaen"/>
+          <w:sz w:val="18"/>
+          <w:szCs w:val="18"/>
+          <w:lang w:val="hy-AM"/>
+        </w:rPr>
+        <w:t xml:space="preserve">                                                                            </w:t>
+      </w:r>
+      <w:r>
+        <w:rPr>
+          <w:rFonts w:ascii="Sylfaen" w:hAnsi="Sylfaen"/>
+          <w:sz w:val="18"/>
+          <w:szCs w:val="18"/>
+          <w:lang w:val="hy-AM"/>
+        </w:rPr>
+        <w:tab/>
+      </w:r>
+      <w:r>
+        <w:rPr>
+          <w:rFonts w:ascii="Sylfaen" w:hAnsi="Sylfaen"/>
+          <w:sz w:val="18"/>
+          <w:szCs w:val="18"/>
+          <w:lang w:val="hy-AM"/>
+        </w:rPr>
+        <w:tab/>
+        <w:t>(</w:t>
+      </w:r>
+      <w:r>
+        <w:rPr>
+          <w:rFonts w:ascii="Sylfaen" w:hAnsi="Sylfaen" w:cs="Sylfaen"/>
+          <w:sz w:val="18"/>
+          <w:szCs w:val="18"/>
+          <w:lang w:val="hy-AM"/>
+        </w:rPr>
+        <w:t>Ա</w:t>
+      </w:r>
+      <w:r>
+        <w:rPr>
+          <w:rFonts w:ascii="Sylfaen" w:hAnsi="Sylfaen" w:cs="Arial Armenian"/>
+          <w:sz w:val="18"/>
+          <w:szCs w:val="18"/>
+          <w:lang w:val="hy-AM"/>
+        </w:rPr>
+        <w:t>.</w:t>
+      </w:r>
+      <w:r>
+        <w:rPr>
+          <w:rFonts w:ascii="Sylfaen" w:hAnsi="Sylfaen" w:cs="Sylfaen"/>
+          <w:sz w:val="18"/>
+          <w:szCs w:val="18"/>
+          <w:lang w:val="hy-AM"/>
+        </w:rPr>
+        <w:t>Ա</w:t>
+      </w:r>
+      <w:r>
+        <w:rPr>
+          <w:rFonts w:ascii="Sylfaen" w:hAnsi="Sylfaen" w:cs="Arial Armenian"/>
+          <w:sz w:val="18"/>
+          <w:szCs w:val="18"/>
+          <w:lang w:val="hy-AM"/>
+        </w:rPr>
+        <w:t>.</w:t>
+      </w:r>
+      <w:r>
+        <w:rPr>
+          <w:rFonts w:ascii="Sylfaen" w:hAnsi="Sylfaen" w:cs="Sylfaen"/>
+          <w:sz w:val="18"/>
+          <w:szCs w:val="18"/>
+          <w:lang w:val="hy-AM"/>
+        </w:rPr>
+        <w:t>Հ</w:t>
+      </w:r>
+      <w:r>
+        <w:rPr>
+          <w:rFonts w:ascii="Sylfaen" w:hAnsi="Sylfaen" w:cs="Arial Armenian"/>
+          <w:sz w:val="18"/>
+          <w:szCs w:val="18"/>
+          <w:lang w:val="hy-AM"/>
+        </w:rPr>
+        <w:t xml:space="preserve">., </w:t>
+      </w:r>
+      <w:r>
+        <w:rPr>
+          <w:rFonts w:ascii="Sylfaen" w:hAnsi="Sylfaen" w:cs="Sylfaen"/>
+          <w:sz w:val="18"/>
+          <w:szCs w:val="18"/>
+          <w:lang w:val="hy-AM"/>
+        </w:rPr>
+        <w:t>ստորագրություն</w:t>
+      </w:r>
+      <w:r>
+        <w:rPr>
+          <w:rFonts w:ascii="Sylfaen" w:hAnsi="Sylfaen" w:cs="Arial Armenian"/>
+          <w:sz w:val="18"/>
+          <w:szCs w:val="18"/>
+          <w:lang w:val="hy-AM"/>
+        </w:rPr>
+        <w:t xml:space="preserve">, </w:t>
+      </w:r>
+      <w:r>
+        <w:rPr>
+          <w:rFonts w:ascii="Sylfaen" w:hAnsi="Sylfaen" w:cs="Sylfaen"/>
+          <w:sz w:val="18"/>
+          <w:szCs w:val="18"/>
+          <w:lang w:val="hy-AM"/>
+        </w:rPr>
+        <w:t>ամսաթիվ</w:t>
+      </w:r>
+      <w:r>
+        <w:rPr>
+          <w:rFonts w:ascii="Sylfaen" w:hAnsi="Sylfaen"/>
+          <w:sz w:val="18"/>
+          <w:szCs w:val="18"/>
+          <w:lang w:val="hy-AM"/>
+        </w:rPr>
+        <w:t>)</w:t>
+      </w:r>
+    </w:p>
+    <w:p>
+      <w:pPr>
+        <w:spacing w:line="240" w:lineRule="auto"/>
+        <w:rPr>
+          <w:rFonts w:ascii="Sylfaen" w:hAnsi="Sylfaen"/>
           <w:sz w:val="16"/>
           <w:szCs w:val="16"/>
-          <w:u w:val="single"/>
           <w:lang w:val="hy-AM"/>
         </w:rPr>
       </w:pPr>
@@ -5242,29 +5526,95 @@
           <w:rFonts w:ascii="Sylfaen" w:hAnsi="Sylfaen"/>
           <w:lang w:val="hy-AM"/>
         </w:rPr>
-        <w:t xml:space="preserve">9.1. </w:t>
-      </w:r>
-      <w:r>
-        <w:rPr>
-          <w:rFonts w:ascii="Sylfaen" w:hAnsi="Sylfaen" w:cs="Sylfaen"/>
-          <w:lang w:val="hy-AM"/>
-        </w:rPr>
-        <w:t>Էկոնոմիկական</w:t>
-      </w:r>
-      <w:r>
-        <w:rPr>
-          <w:rFonts w:ascii="Sylfaen" w:hAnsi="Sylfaen" w:cs="Arial Armenian"/>
-          <w:u w:val="single"/>
-          <w:lang w:val="hy-AM"/>
-        </w:rPr>
-        <w:t xml:space="preserve">    </w:t>
-      </w:r>
-      <w:r>
-        <w:rPr>
-          <w:rFonts w:ascii="Sylfaen" w:hAnsi="Sylfaen" w:cs="Arial Armenian"/>
-          <w:lang w:val="hy-AM"/>
-        </w:rPr>
-        <w:t>_________________________________________________________________</w:t>
+        <w:t xml:space="preserve">9.3. </w:t>
+      </w:r>
+      <w:r>
+        <w:rPr>
+          <w:rFonts w:ascii="Sylfaen" w:hAnsi="Sylfaen" w:cs="Sylfaen"/>
+          <w:lang w:val="hy-AM"/>
+        </w:rPr>
+        <w:t>Բնապահպանության</w:t>
+      </w:r>
+      <w:r>
+        <w:rPr>
+          <w:rFonts w:ascii="Sylfaen" w:hAnsi="Sylfaen" w:cs="Arial Armenian"/>
+          <w:lang w:val="hy-AM"/>
+        </w:rPr>
+        <w:t xml:space="preserve"> </w:t>
+      </w:r>
+      <w:r>
+        <w:rPr>
+          <w:rFonts w:ascii="Sylfaen" w:hAnsi="Sylfaen" w:cs="Arial Armenian"/>
+        </w:rPr>
+        <w:t xml:space="preserve"> </w:t>
+      </w:r>
+      <w:r>
+        <w:rPr>
+          <w:rFonts w:ascii="Times New Roman" w:hAnsi="Times New Roman"/>
+          <w:u w:val="single"/>
+          <w:lang w:val="it-IT"/>
+        </w:rPr>
+        <w:t>Կոստանյա</w:t>
+      </w:r>
+      <w:r>
+        <w:rPr>
+          <w:rFonts w:ascii="Times New Roman" w:hAnsi="Times New Roman"/>
+          <w:u w:val="single"/>
+          <w:lang w:val="hy-AM"/>
+        </w:rPr>
+        <w:t xml:space="preserve"> </w:t>
+      </w:r>
+      <w:r>
+        <w:rPr>
+          <w:rFonts w:ascii="Times New Roman" w:hAnsi="Times New Roman"/>
+          <w:u w:val="single"/>
+          <w:lang w:val="it-IT"/>
+        </w:rPr>
+        <w:t>Գայանե</w:t>
+      </w:r>
+      <w:r>
+        <w:rPr>
+          <w:rFonts w:ascii="Times New Roman" w:hAnsi="Times New Roman"/>
+          <w:u w:val="single"/>
+          <w:lang w:val="hy-AM"/>
+        </w:rPr>
+        <w:t xml:space="preserve"> </w:t>
+      </w:r>
+      <w:r>
+        <w:rPr>
+          <w:rFonts w:ascii="Sylfaen" w:hAnsi="Sylfaen"/>
+          <w:u w:val="single"/>
+          <w:lang w:val="af-ZA"/>
+        </w:rPr>
+        <w:t>Ռուդոլֆի</w:t>
+      </w:r>
+      <w:r>
+        <w:rPr>
+          <w:rFonts w:ascii="Sylfaen" w:hAnsi="Sylfaen" w:cs="Arial Armenian"/>
+          <w:lang w:val="hy-AM"/>
+        </w:rPr>
+        <w:t xml:space="preserve"> </w:t>
+      </w:r>
+      <w:r>
+        <w:rPr>
+          <w:rFonts w:ascii="Sylfaen" w:hAnsi="Sylfaen" w:cs="Arial Armenian"/>
+          <w:lang w:val="hy-AM"/>
+        </w:rPr>
+        <w:t>_________</w:t>
+      </w:r>
+      <w:r>
+        <w:rPr>
+          <w:rFonts w:ascii="Sylfaen" w:hAnsi="Sylfaen" w:cs="Arial Armenian"/>
+          <w:u w:val="single"/>
+        </w:rPr>
+        <w:t xml:space="preserve">                   </w:t>
+      </w:r>
+      <w:r>
+        <w:rPr>
+          <w:rFonts w:ascii="Sylfaen" w:hAnsi="Sylfaen" w:cs="Arial Armenian"/>
+          <w:lang w:val="hy-AM"/>
+        </w:rPr>
+        <w:t>________________</w:t>
       </w:r>
     </w:p>
     <w:p>
@@ -5284,7 +5634,7 @@
           <w:szCs w:val="18"/>
           <w:lang w:val="hy-AM"/>
         </w:rPr>
-        <w:t xml:space="preserve">                                                                            (</w:t>
+        <w:t xml:space="preserve">                                                                                     (</w:t>
       </w:r>
       <w:r>
         <w:rPr>
@@ -5402,14 +5752,14 @@
           <w:rFonts w:ascii="Sylfaen" w:hAnsi="Sylfaen"/>
           <w:lang w:val="hy-AM"/>
         </w:rPr>
-        <w:t xml:space="preserve">9.2. </w:t>
-      </w:r>
-      <w:r>
-        <w:rPr>
-          <w:rFonts w:ascii="Sylfaen" w:hAnsi="Sylfaen" w:cs="Sylfaen"/>
-          <w:lang w:val="hy-AM"/>
-        </w:rPr>
-        <w:t>Կենսագործնեության</w:t>
+        <w:t xml:space="preserve">10. </w:t>
+      </w:r>
+      <w:r>
+        <w:rPr>
+          <w:rFonts w:ascii="Sylfaen" w:hAnsi="Sylfaen" w:cs="Sylfaen"/>
+          <w:lang w:val="hy-AM"/>
+        </w:rPr>
+        <w:t>Աշխատանքի</w:t>
       </w:r>
       <w:r>
         <w:rPr>
@@ -5423,22 +5773,28 @@
           <w:rFonts w:ascii="Sylfaen" w:hAnsi="Sylfaen" w:cs="Sylfaen"/>
           <w:lang w:val="hy-AM"/>
         </w:rPr>
-        <w:t>անվտանգության</w:t>
-      </w:r>
-      <w:r>
-        <w:rPr>
-          <w:rFonts w:ascii="Sylfaen" w:hAnsi="Sylfaen" w:cs="Arial Armenian"/>
-          <w:u w:val="single"/>
-          <w:lang w:val="hy-AM"/>
-        </w:rPr>
-        <w:t xml:space="preserve">   </w:t>
-      </w:r>
-      <w:r>
-        <w:rPr>
-          <w:rFonts w:ascii="Sylfaen" w:hAnsi="Sylfaen" w:cs="Arial Armenian"/>
-          <w:lang w:val="hy-AM"/>
-        </w:rPr>
-        <w:t>____________________________________________</w:t>
+        <w:t>առաջադրանքը</w:t>
+      </w:r>
+      <w:r>
+        <w:rPr>
+          <w:rFonts w:ascii="Sylfaen" w:hAnsi="Sylfaen" w:cs="Arial Armenian"/>
+          <w:lang w:val="hy-AM"/>
+        </w:rPr>
+        <w:t xml:space="preserve"> </w:t>
+      </w:r>
+      <w:r>
+        <w:rPr>
+          <w:rFonts w:ascii="Sylfaen" w:hAnsi="Sylfaen" w:cs="Sylfaen"/>
+          <w:lang w:val="hy-AM"/>
+        </w:rPr>
+        <w:t>ստացա</w:t>
+      </w:r>
+      <w:r>
+        <w:rPr>
+          <w:rFonts w:ascii="Sylfaen" w:hAnsi="Sylfaen" w:cs="Arial Armenian"/>
+          <w:lang w:val="hy-AM"/>
+        </w:rPr>
+        <w:t xml:space="preserve"> ____________________________________</w:t>
       </w:r>
     </w:p>
     <w:p>
@@ -5446,28 +5802,17 @@
         <w:spacing w:line="240" w:lineRule="auto"/>
         <w:rPr>
           <w:rFonts w:ascii="Sylfaen" w:hAnsi="Sylfaen"/>
-          <w:sz w:val="18"/>
-          <w:szCs w:val="18"/>
-          <w:lang w:val="hy-AM"/>
-        </w:rPr>
-      </w:pPr>
-      <w:r>
-        <w:rPr>
-          <w:rFonts w:ascii="Sylfaen" w:hAnsi="Sylfaen"/>
-          <w:sz w:val="18"/>
-          <w:szCs w:val="18"/>
-          <w:lang w:val="hy-AM"/>
-        </w:rPr>
-        <w:t xml:space="preserve">                                                                            </w:t>
-      </w:r>
-      <w:r>
-        <w:rPr>
-          <w:rFonts w:ascii="Sylfaen" w:hAnsi="Sylfaen"/>
-          <w:sz w:val="18"/>
-          <w:szCs w:val="18"/>
-          <w:lang w:val="hy-AM"/>
-        </w:rPr>
-        <w:tab/>
+          <w:lang w:val="hy-AM"/>
+        </w:rPr>
+      </w:pPr>
+      <w:r>
+        <w:rPr>
+          <w:rFonts w:ascii="Sylfaen" w:hAnsi="Sylfaen"/>
+          <w:sz w:val="18"/>
+          <w:szCs w:val="18"/>
+          <w:lang w:val="hy-AM"/>
+        </w:rPr>
+        <w:t xml:space="preserve">                                                                                         </w:t>
       </w:r>
       <w:r>
         <w:rPr>
@@ -5486,52 +5831,16 @@
           <w:szCs w:val="18"/>
           <w:lang w:val="hy-AM"/>
         </w:rPr>
-        <w:t>Ա</w:t>
-      </w:r>
-      <w:r>
-        <w:rPr>
-          <w:rFonts w:ascii="Sylfaen" w:hAnsi="Sylfaen" w:cs="Arial Armenian"/>
-          <w:sz w:val="18"/>
-          <w:szCs w:val="18"/>
-          <w:lang w:val="hy-AM"/>
-        </w:rPr>
-        <w:t>.</w:t>
-      </w:r>
-      <w:r>
-        <w:rPr>
-          <w:rFonts w:ascii="Sylfaen" w:hAnsi="Sylfaen" w:cs="Sylfaen"/>
-          <w:sz w:val="18"/>
-          <w:szCs w:val="18"/>
-          <w:lang w:val="hy-AM"/>
-        </w:rPr>
-        <w:t>Ա</w:t>
-      </w:r>
-      <w:r>
-        <w:rPr>
-          <w:rFonts w:ascii="Sylfaen" w:hAnsi="Sylfaen" w:cs="Arial Armenian"/>
-          <w:sz w:val="18"/>
-          <w:szCs w:val="18"/>
-          <w:lang w:val="hy-AM"/>
-        </w:rPr>
-        <w:t>.</w:t>
-      </w:r>
-      <w:r>
-        <w:rPr>
-          <w:rFonts w:ascii="Sylfaen" w:hAnsi="Sylfaen" w:cs="Sylfaen"/>
-          <w:sz w:val="18"/>
-          <w:szCs w:val="18"/>
-          <w:lang w:val="hy-AM"/>
-        </w:rPr>
-        <w:t>Հ</w:t>
-      </w:r>
-      <w:r>
-        <w:rPr>
-          <w:rFonts w:ascii="Sylfaen" w:hAnsi="Sylfaen" w:cs="Arial Armenian"/>
-          <w:sz w:val="18"/>
-          <w:szCs w:val="18"/>
-          <w:lang w:val="hy-AM"/>
-        </w:rPr>
-        <w:t xml:space="preserve">., </w:t>
+        <w:t>Ուսանողի</w:t>
+      </w:r>
+      <w:r>
+        <w:rPr>
+          <w:rFonts w:ascii="Sylfaen" w:hAnsi="Sylfaen" w:cs="Arial Armenian"/>
+          <w:sz w:val="18"/>
+          <w:szCs w:val="18"/>
+          <w:lang w:val="hy-AM"/>
+        </w:rPr>
+        <w:t xml:space="preserve"> </w:t>
       </w:r>
       <w:r>
         <w:rPr>
@@ -5569,323 +5878,6 @@
         </w:rPr>
         <w:t>)</w:t>
       </w:r>
-    </w:p>
-    <w:p>
-      <w:pPr>
-        <w:spacing w:line="240" w:lineRule="auto"/>
-        <w:rPr>
-          <w:rFonts w:ascii="Sylfaen" w:hAnsi="Sylfaen"/>
-          <w:sz w:val="16"/>
-          <w:szCs w:val="16"/>
-          <w:lang w:val="hy-AM"/>
-        </w:rPr>
-      </w:pPr>
-    </w:p>
-    <w:p>
-      <w:pPr>
-        <w:spacing w:line="240" w:lineRule="auto"/>
-        <w:ind w:firstLine="0"/>
-        <w:rPr>
-          <w:rFonts w:ascii="Sylfaen" w:hAnsi="Sylfaen"/>
-          <w:lang w:val="hy-AM"/>
-        </w:rPr>
-      </w:pPr>
-      <w:r>
-        <w:rPr>
-          <w:rFonts w:ascii="Sylfaen" w:hAnsi="Sylfaen"/>
-          <w:lang w:val="hy-AM"/>
-        </w:rPr>
-        <w:t xml:space="preserve">9.3. </w:t>
-      </w:r>
-      <w:r>
-        <w:rPr>
-          <w:rFonts w:ascii="Sylfaen" w:hAnsi="Sylfaen" w:cs="Sylfaen"/>
-          <w:lang w:val="hy-AM"/>
-        </w:rPr>
-        <w:t>Բնապահպանության</w:t>
-      </w:r>
-      <w:r>
-        <w:rPr>
-          <w:rFonts w:ascii="Sylfaen" w:hAnsi="Sylfaen" w:cs="Arial Armenian"/>
-          <w:lang w:val="hy-AM"/>
-        </w:rPr>
-        <w:t xml:space="preserve"> _____________________________________________________________</w:t>
-      </w:r>
-    </w:p>
-    <w:p>
-      <w:pPr>
-        <w:spacing w:line="240" w:lineRule="auto"/>
-        <w:rPr>
-          <w:rFonts w:ascii="Sylfaen" w:hAnsi="Sylfaen"/>
-          <w:sz w:val="18"/>
-          <w:szCs w:val="18"/>
-          <w:lang w:val="hy-AM"/>
-        </w:rPr>
-      </w:pPr>
-      <w:r>
-        <w:rPr>
-          <w:rFonts w:ascii="Sylfaen" w:hAnsi="Sylfaen"/>
-          <w:sz w:val="18"/>
-          <w:szCs w:val="18"/>
-          <w:lang w:val="hy-AM"/>
-        </w:rPr>
-        <w:t xml:space="preserve">                                                                                     (</w:t>
-      </w:r>
-      <w:r>
-        <w:rPr>
-          <w:rFonts w:ascii="Sylfaen" w:hAnsi="Sylfaen" w:cs="Sylfaen"/>
-          <w:sz w:val="18"/>
-          <w:szCs w:val="18"/>
-          <w:lang w:val="hy-AM"/>
-        </w:rPr>
-        <w:t>Ա</w:t>
-      </w:r>
-      <w:r>
-        <w:rPr>
-          <w:rFonts w:ascii="Sylfaen" w:hAnsi="Sylfaen" w:cs="Arial Armenian"/>
-          <w:sz w:val="18"/>
-          <w:szCs w:val="18"/>
-          <w:lang w:val="hy-AM"/>
-        </w:rPr>
-        <w:t>.</w:t>
-      </w:r>
-      <w:r>
-        <w:rPr>
-          <w:rFonts w:ascii="Sylfaen" w:hAnsi="Sylfaen" w:cs="Sylfaen"/>
-          <w:sz w:val="18"/>
-          <w:szCs w:val="18"/>
-          <w:lang w:val="hy-AM"/>
-        </w:rPr>
-        <w:t>Ա</w:t>
-      </w:r>
-      <w:r>
-        <w:rPr>
-          <w:rFonts w:ascii="Sylfaen" w:hAnsi="Sylfaen" w:cs="Arial Armenian"/>
-          <w:sz w:val="18"/>
-          <w:szCs w:val="18"/>
-          <w:lang w:val="hy-AM"/>
-        </w:rPr>
-        <w:t>.</w:t>
-      </w:r>
-      <w:r>
-        <w:rPr>
-          <w:rFonts w:ascii="Sylfaen" w:hAnsi="Sylfaen" w:cs="Sylfaen"/>
-          <w:sz w:val="18"/>
-          <w:szCs w:val="18"/>
-          <w:lang w:val="hy-AM"/>
-        </w:rPr>
-        <w:t>Հ</w:t>
-      </w:r>
-      <w:r>
-        <w:rPr>
-          <w:rFonts w:ascii="Sylfaen" w:hAnsi="Sylfaen" w:cs="Arial Armenian"/>
-          <w:sz w:val="18"/>
-          <w:szCs w:val="18"/>
-          <w:lang w:val="hy-AM"/>
-        </w:rPr>
-        <w:t xml:space="preserve">., </w:t>
-      </w:r>
-      <w:r>
-        <w:rPr>
-          <w:rFonts w:ascii="Sylfaen" w:hAnsi="Sylfaen" w:cs="Sylfaen"/>
-          <w:sz w:val="18"/>
-          <w:szCs w:val="18"/>
-          <w:lang w:val="hy-AM"/>
-        </w:rPr>
-        <w:t>ստորագրություն</w:t>
-      </w:r>
-      <w:r>
-        <w:rPr>
-          <w:rFonts w:ascii="Sylfaen" w:hAnsi="Sylfaen" w:cs="Arial Armenian"/>
-          <w:sz w:val="18"/>
-          <w:szCs w:val="18"/>
-          <w:lang w:val="hy-AM"/>
-        </w:rPr>
-        <w:t xml:space="preserve">, </w:t>
-      </w:r>
-      <w:r>
-        <w:rPr>
-          <w:rFonts w:ascii="Sylfaen" w:hAnsi="Sylfaen" w:cs="Sylfaen"/>
-          <w:sz w:val="18"/>
-          <w:szCs w:val="18"/>
-          <w:lang w:val="hy-AM"/>
-        </w:rPr>
-        <w:t>ամսաթիվ</w:t>
-      </w:r>
-      <w:r>
-        <w:rPr>
-          <w:rFonts w:ascii="Sylfaen" w:hAnsi="Sylfaen"/>
-          <w:sz w:val="18"/>
-          <w:szCs w:val="18"/>
-          <w:lang w:val="hy-AM"/>
-        </w:rPr>
-        <w:t>)</w:t>
-      </w:r>
-    </w:p>
-    <w:p>
-      <w:pPr>
-        <w:spacing w:line="240" w:lineRule="auto"/>
-        <w:rPr>
-          <w:rFonts w:ascii="Sylfaen" w:hAnsi="Sylfaen"/>
-          <w:sz w:val="16"/>
-          <w:szCs w:val="16"/>
-          <w:lang w:val="hy-AM"/>
-        </w:rPr>
-      </w:pPr>
-    </w:p>
-    <w:p>
-      <w:pPr>
-        <w:spacing w:line="240" w:lineRule="auto"/>
-        <w:ind w:firstLine="0"/>
-        <w:rPr>
-          <w:rFonts w:ascii="Sylfaen" w:hAnsi="Sylfaen"/>
-          <w:lang w:val="hy-AM"/>
-        </w:rPr>
-      </w:pPr>
-      <w:r>
-        <w:rPr>
-          <w:rFonts w:ascii="Sylfaen" w:hAnsi="Sylfaen"/>
-          <w:lang w:val="hy-AM"/>
-        </w:rPr>
-        <w:t xml:space="preserve">10. </w:t>
-      </w:r>
-      <w:r>
-        <w:rPr>
-          <w:rFonts w:ascii="Sylfaen" w:hAnsi="Sylfaen" w:cs="Sylfaen"/>
-          <w:lang w:val="hy-AM"/>
-        </w:rPr>
-        <w:t>Աշխատանքի</w:t>
-      </w:r>
-      <w:r>
-        <w:rPr>
-          <w:rFonts w:ascii="Sylfaen" w:hAnsi="Sylfaen" w:cs="Arial Armenian"/>
-          <w:lang w:val="hy-AM"/>
-        </w:rPr>
-        <w:t xml:space="preserve"> </w:t>
-      </w:r>
-      <w:r>
-        <w:rPr>
-          <w:rFonts w:ascii="Sylfaen" w:hAnsi="Sylfaen" w:cs="Sylfaen"/>
-          <w:lang w:val="hy-AM"/>
-        </w:rPr>
-        <w:t>առաջադրանքը</w:t>
-      </w:r>
-      <w:r>
-        <w:rPr>
-          <w:rFonts w:ascii="Sylfaen" w:hAnsi="Sylfaen" w:cs="Arial Armenian"/>
-          <w:lang w:val="hy-AM"/>
-        </w:rPr>
-        <w:t xml:space="preserve"> </w:t>
-      </w:r>
-      <w:r>
-        <w:rPr>
-          <w:rFonts w:ascii="Sylfaen" w:hAnsi="Sylfaen" w:cs="Sylfaen"/>
-          <w:lang w:val="hy-AM"/>
-        </w:rPr>
-        <w:t>ստացա</w:t>
-      </w:r>
-      <w:r>
-        <w:rPr>
-          <w:rFonts w:ascii="Sylfaen" w:hAnsi="Sylfaen" w:cs="Arial Armenian"/>
-          <w:lang w:val="hy-AM"/>
-        </w:rPr>
-        <w:t xml:space="preserve"> ____________________________________</w:t>
-      </w:r>
-    </w:p>
-    <w:p>
-      <w:pPr>
-        <w:spacing w:line="240" w:lineRule="auto"/>
-        <w:rPr>
-          <w:rFonts w:ascii="Sylfaen" w:hAnsi="Sylfaen"/>
-          <w:lang w:val="hy-AM"/>
-        </w:rPr>
-      </w:pPr>
-      <w:r>
-        <w:rPr>
-          <w:rFonts w:ascii="Sylfaen" w:hAnsi="Sylfaen"/>
-          <w:sz w:val="18"/>
-          <w:szCs w:val="18"/>
-          <w:lang w:val="hy-AM"/>
-        </w:rPr>
-        <w:t xml:space="preserve">                                                                                         </w:t>
-      </w:r>
-      <w:r>
-        <w:rPr>
-          <w:rFonts w:ascii="Sylfaen" w:hAnsi="Sylfaen"/>
-          <w:sz w:val="18"/>
-          <w:szCs w:val="18"/>
-          <w:lang w:val="hy-AM"/>
-        </w:rPr>
-        <w:tab/>
-        <w:t>(</w:t>
-      </w:r>
-      <w:r>
-        <w:rPr>
-          <w:rFonts w:ascii="Sylfaen" w:hAnsi="Sylfaen" w:cs="Sylfaen"/>
-          <w:sz w:val="18"/>
-          <w:szCs w:val="18"/>
-          <w:lang w:val="hy-AM"/>
-        </w:rPr>
-        <w:t>Ուսանողի</w:t>
-      </w:r>
-      <w:r>
-        <w:rPr>
-          <w:rFonts w:ascii="Sylfaen" w:hAnsi="Sylfaen" w:cs="Arial Armenian"/>
-          <w:sz w:val="18"/>
-          <w:szCs w:val="18"/>
-          <w:lang w:val="hy-AM"/>
-        </w:rPr>
-        <w:t xml:space="preserve"> </w:t>
-      </w:r>
-      <w:r>
-        <w:rPr>
-          <w:rFonts w:ascii="Sylfaen" w:hAnsi="Sylfaen" w:cs="Sylfaen"/>
-          <w:sz w:val="18"/>
-          <w:szCs w:val="18"/>
-          <w:lang w:val="hy-AM"/>
-        </w:rPr>
-        <w:t>ստորագրություն</w:t>
-      </w:r>
-      <w:r>
-        <w:rPr>
-          <w:rFonts w:ascii="Sylfaen" w:hAnsi="Sylfaen" w:cs="Arial Armenian"/>
-          <w:sz w:val="18"/>
-          <w:szCs w:val="18"/>
-          <w:lang w:val="hy-AM"/>
-        </w:rPr>
-        <w:t xml:space="preserve">, </w:t>
-      </w:r>
-      <w:r>
-        <w:rPr>
-          <w:rFonts w:ascii="Sylfaen" w:hAnsi="Sylfaen" w:cs="Sylfaen"/>
-          <w:sz w:val="18"/>
-          <w:szCs w:val="18"/>
-          <w:lang w:val="hy-AM"/>
-        </w:rPr>
-        <w:t>ամսաթիվ</w:t>
-      </w:r>
-      <w:r>
-        <w:rPr>
-          <w:rFonts w:ascii="Sylfaen" w:hAnsi="Sylfaen"/>
-          <w:sz w:val="18"/>
-          <w:szCs w:val="18"/>
-          <w:lang w:val="hy-AM"/>
-        </w:rPr>
-        <w:t>)</w:t>
-      </w:r>
-    </w:p>
-    <w:p>
-      <w:pPr>
-        <w:spacing w:line="240" w:lineRule="auto"/>
-        <w:ind w:firstLine="0"/>
-        <w:jc w:val="left"/>
-        <w:rPr>
-          <w:rFonts w:ascii="Sylfaen" w:hAnsi="Sylfaen"/>
-          <w:b/>
-          <w:bCs/>
-          <w:lang w:val="hy-AM"/>
-        </w:rPr>
-      </w:pPr>
     </w:p>
     <w:sectPr>
       <w:pgSz w:w="12240" w:h="15840"/>
@@ -9055,7 +9047,7 @@
 </file>
 
 <file path=customXml/itemProps1.xml><?xml version="1.0" encoding="utf-8"?>
-<ds:datastoreItem xmlns:ds="http://schemas.openxmlformats.org/officeDocument/2006/customXml" ds:itemID="{90CCC301-4E85-4C79-9BC0-D799193F76FA}">
+<ds:datastoreItem xmlns:ds="http://schemas.openxmlformats.org/officeDocument/2006/customXml" ds:itemID="{41EC70F6-F59B-42AC-BE10-A7068AE89712}">
   <ds:schemaRefs>
     <ds:schemaRef ds:uri="http://schemas.openxmlformats.org/officeDocument/2006/bibliography"/>
   </ds:schemaRefs>

</xml_diff>

<commit_message>
adding presentation + disc related files
</commit_message>
<xml_diff>
--- a/Առաջադրանք_ԹԵՐԹԻԿ_Հայկ_Հովսեփյան.docx
+++ b/Առաջադրանք_ԹԵՐԹԻԿ_Հայկ_Հովսեփյան.docx
@@ -967,6 +967,22 @@
           <w:u w:val="single"/>
           <w:lang w:val="it-IT"/>
         </w:rPr>
+        <w:t>Գայանե</w:t>
+      </w:r>
+      <w:r>
+        <w:rPr>
+          <w:rFonts w:ascii="Times New Roman" w:hAnsi="Times New Roman"/>
+          <w:u w:val="single"/>
+          <w:lang w:val="hy-AM"/>
+        </w:rPr>
+        <w:t xml:space="preserve"> </w:t>
+      </w:r>
+      <w:r>
+        <w:rPr>
+          <w:rFonts w:ascii="Times New Roman" w:hAnsi="Times New Roman"/>
+          <w:u w:val="single"/>
+          <w:lang w:val="it-IT"/>
+        </w:rPr>
         <w:t>Կոստանյա</w:t>
       </w:r>
       <w:r>
@@ -975,21 +991,13 @@
           <w:u w:val="single"/>
           <w:lang w:val="hy-AM"/>
         </w:rPr>
-        <w:t xml:space="preserve"> </w:t>
-      </w:r>
-      <w:r>
-        <w:rPr>
-          <w:rFonts w:ascii="Times New Roman" w:hAnsi="Times New Roman"/>
-          <w:u w:val="single"/>
-          <w:lang w:val="it-IT"/>
-        </w:rPr>
-        <w:t>Գայանե</w:t>
-      </w:r>
-      <w:r>
-        <w:rPr>
-          <w:rFonts w:ascii="Times New Roman" w:hAnsi="Times New Roman"/>
-          <w:u w:val="single"/>
-          <w:lang w:val="hy-AM"/>
+        <w:t>ն</w:t>
+      </w:r>
+      <w:r>
+        <w:rPr>
+          <w:rFonts w:ascii="Sylfaen" w:hAnsi="Sylfaen"/>
+          <w:u w:val="single"/>
+          <w:lang w:val="af-ZA"/>
         </w:rPr>
         <w:t xml:space="preserve"> </w:t>
       </w:r>
@@ -4302,8 +4310,6 @@
               </w:rPr>
               <w:t>.-01</w:t>
             </w:r>
-            <w:bookmarkStart w:id="3" w:name="_GoBack"/>
-            <w:bookmarkEnd w:id="3"/>
             <w:r>
               <w:rPr>
                 <w:rFonts w:ascii="Sylfaen" w:hAnsi="Sylfaen"/>
@@ -5618,6 +5624,22 @@
           <w:u w:val="single"/>
           <w:lang w:val="it-IT"/>
         </w:rPr>
+        <w:t>Գայանե</w:t>
+      </w:r>
+      <w:r>
+        <w:rPr>
+          <w:rFonts w:ascii="Times New Roman" w:hAnsi="Times New Roman"/>
+          <w:u w:val="single"/>
+          <w:lang w:val="it-IT"/>
+        </w:rPr>
+        <w:t xml:space="preserve"> </w:t>
+      </w:r>
+      <w:r>
+        <w:rPr>
+          <w:rFonts w:ascii="Times New Roman" w:hAnsi="Times New Roman"/>
+          <w:u w:val="single"/>
+          <w:lang w:val="it-IT"/>
+        </w:rPr>
         <w:t>Կոստանյա</w:t>
       </w:r>
       <w:r>
@@ -5626,15 +5648,7 @@
           <w:u w:val="single"/>
           <w:lang w:val="hy-AM"/>
         </w:rPr>
-        <w:t xml:space="preserve"> </w:t>
-      </w:r>
-      <w:r>
-        <w:rPr>
-          <w:rFonts w:ascii="Times New Roman" w:hAnsi="Times New Roman"/>
-          <w:u w:val="single"/>
-          <w:lang w:val="it-IT"/>
-        </w:rPr>
-        <w:t>Գայանե</w:t>
+        <w:t>ն</w:t>
       </w:r>
       <w:r>
         <w:rPr>
@@ -5802,6 +5816,8 @@
           <w:lang w:val="hy-AM"/>
         </w:rPr>
       </w:pPr>
+      <w:bookmarkStart w:id="3" w:name="_GoBack"/>
+      <w:bookmarkEnd w:id="3"/>
     </w:p>
     <w:p>
       <w:pPr>
@@ -9112,7 +9128,7 @@
 </file>
 
 <file path=customXml/itemProps1.xml><?xml version="1.0" encoding="utf-8"?>
-<ds:datastoreItem xmlns:ds="http://schemas.openxmlformats.org/officeDocument/2006/customXml" ds:itemID="{1C689E09-AA55-4FB2-8841-199B9F216F27}">
+<ds:datastoreItem xmlns:ds="http://schemas.openxmlformats.org/officeDocument/2006/customXml" ds:itemID="{1FB8B973-F987-4E8D-84D1-154EE2AF6D2A}">
   <ds:schemaRefs>
     <ds:schemaRef ds:uri="http://schemas.openxmlformats.org/officeDocument/2006/bibliography"/>
   </ds:schemaRefs>

</xml_diff>